<commit_message>
10/14 V3: cut phone repair kiosk (A3), renumber clips, update Teresa cheat sheet
Co-Authored-By: Claude Opus 5.5 <noreply@anthropic.com>
Claude-Session: https://claude.ai/code/session_01F5T5EfKU7bvTfCbU31zr39
</commit_message>
<xml_diff>
--- a/runs/W_10142026/bible_v3/10_14 F2 BIBLE V3.docx
+++ b/runs/W_10142026/bible_v3/10_14 F2 BIBLE V3.docx
@@ -203,51 +203,6 @@
           <w:sz w:val="36"/>
         </w:rPr>
         <w:t>-ONE STORE OWNER TOOK A 75-YEAR-OLD STRAIGHT TO HER BANK… AND YOU WON'T BELIEVE WHO STOPPED HIM.</w:t>
-      </w:r>
-    </w:p>
-    <w:p>
-      <w:pPr>
-        <w:spacing w:lineRule="auto" w:line="276" w:before="0" w:after="0"/>
-      </w:pPr>
-      <w:r>
-        <w:rPr>
-          <w:rFonts w:ascii="Arial" w:hAnsi="Arial" w:cs="Arial" w:eastAsia="Arial"/>
-          <w:b w:val="0"/>
-          <w:color w:val="000000"/>
-          <w:sz w:val="36"/>
-        </w:rPr>
-      </w:r>
-    </w:p>
-    <w:p>
-      <w:pPr>
-        <w:spacing w:lineRule="auto" w:line="276" w:before="0" w:after="0"/>
-      </w:pPr>
-      <w:r>
-        <w:rPr>
-          <w:rFonts w:ascii="Arial" w:hAnsi="Arial" w:cs="Arial" w:eastAsia="Arial"/>
-          <w:b w:val="0"/>
-          <w:color w:val="000000"/>
-          <w:sz w:val="36"/>
-        </w:rPr>
-        <w:t xml:space="preserve">-PLUS THE MALL KIOSK THAT TAKES YOUR CRACKED PHONE… AND HANDS IT BACK </w:t>
-      </w:r>
-      <w:r>
-        <w:rPr>
-          <w:rFonts w:ascii="Arial" w:hAnsi="Arial" w:cs="Arial" w:eastAsia="Arial"/>
-          <w:b/>
-          <w:color w:val="000000"/>
-          <w:sz w:val="36"/>
-        </w:rPr>
-        <w:t>DEAD</w:t>
-      </w:r>
-      <w:r>
-        <w:rPr>
-          <w:rFonts w:ascii="Arial" w:hAnsi="Arial" w:cs="Arial" w:eastAsia="Arial"/>
-          <w:b w:val="0"/>
-          <w:color w:val="000000"/>
-          <w:sz w:val="36"/>
-        </w:rPr>
-        <w:t>!!</w:t>
       </w:r>
     </w:p>
     <w:p>
@@ -1755,88 +1710,34 @@
           <w:color w:val="000000"/>
           <w:sz w:val="46"/>
         </w:rPr>
-        <w:t>AND THAT'S NOT THE ONLY SCAM AT THE MALL RIGHT NOW!!</w:t>
-      </w:r>
-    </w:p>
-    <w:p>
-      <w:pPr>
-        <w:spacing w:lineRule="auto" w:line="276" w:before="0" w:after="0"/>
-      </w:pPr>
-      <w:r>
-        <w:rPr>
-          <w:rFonts w:ascii="Arial" w:hAnsi="Arial" w:cs="Arial" w:eastAsia="Arial"/>
-          <w:b w:val="0"/>
-          <w:color w:val="000000"/>
-          <w:sz w:val="36"/>
-        </w:rPr>
-      </w:r>
-    </w:p>
-    <w:p>
-      <w:pPr>
-        <w:spacing w:lineRule="auto" w:line="276" w:before="0" w:after="0"/>
-      </w:pPr>
-      <w:r>
-        <w:rPr>
-          <w:rFonts w:ascii="Arial" w:hAnsi="Arial" w:cs="Arial" w:eastAsia="Arial"/>
-          <w:b w:val="0"/>
-          <w:color w:val="000000"/>
-          <w:sz w:val="36"/>
-        </w:rPr>
-        <w:t>-YOU CRACKED YOUR PHONE SCREEN. THE KIOSK IN THE MIDDLE OF THE MALL SAYS IT CAN FIX IT WHILE YOU SHOP.</w:t>
-      </w:r>
-    </w:p>
-    <w:p>
-      <w:pPr>
-        <w:spacing w:lineRule="auto" w:line="276" w:before="0" w:after="0"/>
-      </w:pPr>
-      <w:r>
-        <w:rPr>
-          <w:rFonts w:ascii="Arial" w:hAnsi="Arial" w:cs="Arial" w:eastAsia="Arial"/>
-          <w:b w:val="0"/>
-          <w:color w:val="000000"/>
-          <w:sz w:val="36"/>
-        </w:rPr>
-      </w:r>
-    </w:p>
-    <w:p>
-      <w:pPr>
-        <w:spacing w:lineRule="auto" w:line="276" w:before="0" w:after="0"/>
-      </w:pPr>
-      <w:r>
-        <w:rPr>
-          <w:rFonts w:ascii="Arial" w:hAnsi="Arial" w:cs="Arial" w:eastAsia="Arial"/>
-          <w:b w:val="0"/>
-          <w:color w:val="000000"/>
-          <w:sz w:val="36"/>
-        </w:rPr>
-        <w:t>-YOU HAND OVER YOUR PHONE. YOU SIGN THE FORM. YOU GO GET A COFFEE.</w:t>
-      </w:r>
-    </w:p>
-    <w:p>
-      <w:pPr>
-        <w:spacing w:lineRule="auto" w:line="276" w:before="0" w:after="0"/>
-      </w:pPr>
-      <w:r>
-        <w:rPr>
-          <w:rFonts w:ascii="Arial" w:hAnsi="Arial" w:cs="Arial" w:eastAsia="Arial"/>
-          <w:b w:val="0"/>
-          <w:color w:val="000000"/>
-          <w:sz w:val="36"/>
-        </w:rPr>
-      </w:r>
-    </w:p>
-    <w:p>
-      <w:pPr>
-        <w:spacing w:lineRule="auto" w:line="276" w:before="0" w:after="0"/>
-      </w:pPr>
-      <w:r>
-        <w:rPr>
-          <w:rFonts w:ascii="Arial" w:hAnsi="Arial" w:cs="Arial" w:eastAsia="Arial"/>
-          <w:b w:val="0"/>
-          <w:color w:val="000000"/>
-          <w:sz w:val="36"/>
-        </w:rPr>
-        <w:t xml:space="preserve">-THIS WOMAN IN KENTUCKY PAID </w:t>
+        <w:t>SO HOW DO YOU WALK AWAY… BEFORE YOU EVER SIT DOWN?</w:t>
+      </w:r>
+    </w:p>
+    <w:p>
+      <w:pPr>
+        <w:spacing w:lineRule="auto" w:line="276" w:before="0" w:after="0"/>
+      </w:pPr>
+      <w:r>
+        <w:rPr>
+          <w:rFonts w:ascii="Arial" w:hAnsi="Arial" w:cs="Arial" w:eastAsia="Arial"/>
+          <w:b w:val="0"/>
+          <w:color w:val="000000"/>
+          <w:sz w:val="36"/>
+        </w:rPr>
+      </w:r>
+    </w:p>
+    <w:p>
+      <w:pPr>
+        <w:spacing w:lineRule="auto" w:line="276" w:before="0" w:after="0"/>
+      </w:pPr>
+      <w:r>
+        <w:rPr>
+          <w:rFonts w:ascii="Arial" w:hAnsi="Arial" w:cs="Arial" w:eastAsia="Arial"/>
+          <w:b w:val="0"/>
+          <w:color w:val="000000"/>
+          <w:sz w:val="36"/>
+        </w:rPr>
+        <w:t xml:space="preserve">-I WANT TO BRING IN </w:t>
       </w:r>
       <w:r>
         <w:rPr>
@@ -1845,115 +1746,43 @@
           <w:color w:val="000000"/>
           <w:sz w:val="36"/>
         </w:rPr>
-        <w:t>100 DOLLARS</w:t>
-      </w:r>
-      <w:r>
-        <w:rPr>
-          <w:rFonts w:ascii="Arial" w:hAnsi="Arial" w:cs="Arial" w:eastAsia="Arial"/>
-          <w:b w:val="0"/>
-          <w:color w:val="000000"/>
-          <w:sz w:val="36"/>
-        </w:rPr>
-        <w:t xml:space="preserve"> FOR A NEW SCREEN AT A MALL KIOSK.</w:t>
-      </w:r>
-    </w:p>
-    <w:p>
-      <w:pPr>
-        <w:spacing w:lineRule="auto" w:line="276" w:before="0" w:after="0"/>
-      </w:pPr>
-      <w:r>
-        <w:rPr>
-          <w:rFonts w:ascii="Arial" w:hAnsi="Arial" w:cs="Arial" w:eastAsia="Arial"/>
-          <w:b w:val="0"/>
-          <w:color w:val="000000"/>
-          <w:sz w:val="36"/>
-        </w:rPr>
-      </w:r>
-    </w:p>
-    <w:p>
-      <w:pPr>
-        <w:spacing w:lineRule="auto" w:line="276" w:before="0" w:after="0"/>
-      </w:pPr>
-      <w:r>
-        <w:rPr>
-          <w:rFonts w:ascii="Arial" w:hAnsi="Arial" w:cs="Arial" w:eastAsia="Arial"/>
-          <w:b w:val="0"/>
-          <w:color w:val="000000"/>
-          <w:sz w:val="36"/>
-        </w:rPr>
-        <w:t>-HALF AN HOUR LATER, THE PHONE KEPT SHUTTING OFF. IT WOULDN'T EVEN CHARGE.</w:t>
-      </w:r>
-    </w:p>
-    <w:p>
-      <w:pPr>
-        <w:spacing w:lineRule="auto" w:line="276" w:before="0" w:after="0"/>
-      </w:pPr>
-      <w:r>
-        <w:rPr>
-          <w:rFonts w:ascii="Arial" w:hAnsi="Arial" w:cs="Arial" w:eastAsia="Arial"/>
-          <w:b w:val="0"/>
-          <w:color w:val="000000"/>
-          <w:sz w:val="36"/>
-        </w:rPr>
-      </w:r>
-    </w:p>
-    <w:p>
-      <w:pPr>
-        <w:spacing w:lineRule="auto" w:line="276" w:before="0" w:after="0"/>
-      </w:pPr>
-      <w:r>
-        <w:rPr>
-          <w:rFonts w:ascii="Arial" w:hAnsi="Arial" w:cs="Arial" w:eastAsia="Arial"/>
-          <w:b w:val="0"/>
-          <w:color w:val="000000"/>
-          <w:sz w:val="36"/>
-        </w:rPr>
-        <w:t xml:space="preserve">-THE KIOSK GAVE HER 100 DOLLARS BACK. BUT A NEW PHONE COST </w:t>
-      </w:r>
-      <w:r>
-        <w:rPr>
-          <w:rFonts w:ascii="Arial" w:hAnsi="Arial" w:cs="Arial" w:eastAsia="Arial"/>
-          <w:b/>
-          <w:color w:val="000000"/>
-          <w:sz w:val="36"/>
-        </w:rPr>
-        <w:t>800</w:t>
-      </w:r>
-      <w:r>
-        <w:rPr>
-          <w:rFonts w:ascii="Arial" w:hAnsi="Arial" w:cs="Arial" w:eastAsia="Arial"/>
-          <w:b w:val="0"/>
-          <w:color w:val="000000"/>
-          <w:sz w:val="36"/>
-        </w:rPr>
-        <w:t>.</w:t>
-      </w:r>
-    </w:p>
-    <w:p>
-      <w:pPr>
-        <w:spacing w:lineRule="auto" w:line="276" w:before="0" w:after="0"/>
-      </w:pPr>
-      <w:r>
-        <w:rPr>
-          <w:rFonts w:ascii="Arial" w:hAnsi="Arial" w:cs="Arial" w:eastAsia="Arial"/>
-          <w:b w:val="0"/>
-          <w:color w:val="000000"/>
-          <w:sz w:val="36"/>
-        </w:rPr>
-      </w:r>
-    </w:p>
-    <w:p>
-      <w:pPr>
-        <w:spacing w:lineRule="auto" w:line="276" w:before="0" w:after="0"/>
-      </w:pPr>
-      <w:r>
-        <w:rPr>
-          <w:rFonts w:ascii="Arial" w:hAnsi="Arial" w:cs="Arial" w:eastAsia="Arial"/>
-          <w:b w:val="0"/>
-          <w:color w:val="000000"/>
-          <w:sz w:val="36"/>
-        </w:rPr>
-        <w:t>-SO WHO PAYS FOR THAT??? LISTEN TO THIS.</w:t>
+        <w:t>TERESA MURRAY</w:t>
+      </w:r>
+      <w:r>
+        <w:rPr>
+          <w:rFonts w:ascii="Arial" w:hAnsi="Arial" w:cs="Arial" w:eastAsia="Arial"/>
+          <w:b w:val="0"/>
+          <w:color w:val="000000"/>
+          <w:sz w:val="36"/>
+        </w:rPr>
+        <w:t>. SHE RUNS THE CONSUMER WATCHDOG OFFICE AT THE U.S. PIRG EDUCATION FUND.</w:t>
+      </w:r>
+    </w:p>
+    <w:p>
+      <w:pPr>
+        <w:spacing w:lineRule="auto" w:line="276" w:before="0" w:after="0"/>
+      </w:pPr>
+      <w:r>
+        <w:rPr>
+          <w:rFonts w:ascii="Arial" w:hAnsi="Arial" w:cs="Arial" w:eastAsia="Arial"/>
+          <w:b w:val="0"/>
+          <w:color w:val="000000"/>
+          <w:sz w:val="36"/>
+        </w:rPr>
+      </w:r>
+    </w:p>
+    <w:p>
+      <w:pPr>
+        <w:spacing w:lineRule="auto" w:line="276" w:before="0" w:after="0"/>
+      </w:pPr>
+      <w:r>
+        <w:rPr>
+          <w:rFonts w:ascii="Arial" w:hAnsi="Arial" w:cs="Arial" w:eastAsia="Arial"/>
+          <w:b w:val="0"/>
+          <w:color w:val="000000"/>
+          <w:sz w:val="36"/>
+        </w:rPr>
+        <w:t>-SHE SPENT TWO DECADES AS A CONSUMER REPORTER… AND NOW SHE TRACKS SCAMS LIKE THESE FOR A LIVING.</w:t>
       </w:r>
     </w:p>
     <w:p>
@@ -1980,7 +1809,20 @@
           <w:color w:val="FF0000"/>
           <w:sz w:val="36"/>
         </w:rPr>
-        <w:t>(((PLAY CLIP 3 HORIZONTAL)))</w:t>
+        <w:t>(((BRING IN TERESA)))</w:t>
+      </w:r>
+    </w:p>
+    <w:p>
+      <w:pPr>
+        <w:spacing w:lineRule="auto" w:line="276" w:before="0" w:after="0"/>
+      </w:pPr>
+      <w:r>
+        <w:rPr>
+          <w:rFonts w:ascii="Arial" w:hAnsi="Arial" w:cs="Arial" w:eastAsia="Arial"/>
+          <w:b w:val="0"/>
+          <w:color w:val="000000"/>
+          <w:sz w:val="36"/>
+        </w:rPr>
       </w:r>
     </w:p>
     <w:p>
@@ -1994,7 +1836,313 @@
           <w:color w:val="FF0000"/>
           <w:sz w:val="36"/>
         </w:rPr>
-        <w:t>OUT:</w:t>
+        <w:t>(((JEFF - KEEP TERESA ON THE TACTICS, NOT BH28 OR THE PEOPLE IN THE CLIPS. THE BH28 CASE IS STILL OPEN.)))</w:t>
+      </w:r>
+    </w:p>
+    <w:p>
+      <w:pPr>
+        <w:spacing w:lineRule="auto" w:line="276" w:before="0" w:after="0"/>
+      </w:pPr>
+      <w:r>
+        <w:rPr>
+          <w:rFonts w:ascii="Arial" w:hAnsi="Arial" w:cs="Arial" w:eastAsia="Arial"/>
+          <w:b w:val="0"/>
+          <w:color w:val="000000"/>
+          <w:sz w:val="36"/>
+        </w:rPr>
+      </w:r>
+    </w:p>
+    <w:p>
+      <w:pPr>
+        <w:spacing w:lineRule="auto" w:line="276" w:before="0" w:after="0"/>
+      </w:pPr>
+      <w:r>
+        <w:rPr>
+          <w:rFonts w:ascii="Arial" w:hAnsi="Arial" w:cs="Arial" w:eastAsia="Arial"/>
+          <w:b w:val="0"/>
+          <w:color w:val="000000"/>
+          <w:sz w:val="36"/>
+        </w:rPr>
+        <w:t>JEFF: TERESA, WHAT'S GOING ON? LET'S GET RIGHT TO IT.</w:t>
+      </w:r>
+    </w:p>
+    <w:p>
+      <w:pPr>
+        <w:spacing w:lineRule="auto" w:line="276" w:before="0" w:after="0"/>
+      </w:pPr>
+      <w:r>
+        <w:rPr>
+          <w:rFonts w:ascii="Arial" w:hAnsi="Arial" w:cs="Arial" w:eastAsia="Arial"/>
+          <w:b w:val="0"/>
+          <w:color w:val="000000"/>
+          <w:sz w:val="36"/>
+        </w:rPr>
+      </w:r>
+    </w:p>
+    <w:p>
+      <w:pPr>
+        <w:spacing w:lineRule="auto" w:line="276" w:before="0" w:after="0"/>
+      </w:pPr>
+      <w:r>
+        <w:rPr>
+          <w:rFonts w:ascii="Arial" w:hAnsi="Arial" w:cs="Arial" w:eastAsia="Arial"/>
+          <w:b w:val="0"/>
+          <w:color w:val="000000"/>
+          <w:sz w:val="36"/>
+        </w:rPr>
+        <w:t>JEFF: NUMBER ONE. HOW DO THESE MALL KIOSKS PULL YOU IN? THE SAMPLE… THE COMPLIMENT… THE CHAIR?</w:t>
+      </w:r>
+    </w:p>
+    <w:p>
+      <w:pPr>
+        <w:spacing w:lineRule="auto" w:line="276" w:before="0" w:after="0"/>
+      </w:pPr>
+      <w:r>
+        <w:rPr>
+          <w:rFonts w:ascii="Arial" w:hAnsi="Arial" w:cs="Arial" w:eastAsia="Arial"/>
+          <w:b w:val="0"/>
+          <w:color w:val="000000"/>
+          <w:sz w:val="36"/>
+        </w:rPr>
+      </w:r>
+    </w:p>
+    <w:p>
+      <w:pPr>
+        <w:spacing w:lineRule="auto" w:line="276" w:before="0" w:after="0"/>
+      </w:pPr>
+      <w:r>
+        <w:rPr>
+          <w:rFonts w:ascii="Arial" w:hAnsi="Arial" w:cs="Arial" w:eastAsia="Arial"/>
+          <w:b w:val="0"/>
+          <w:color w:val="000000"/>
+          <w:sz w:val="36"/>
+        </w:rPr>
+        <w:t>JEFF: NUMBER TWO. SOMEONE STEPS OUT WITH A SAMPLE. WHAT DO YOU ACTUALLY SAY TO WALK AWAY?</w:t>
+      </w:r>
+    </w:p>
+    <w:p>
+      <w:pPr>
+        <w:spacing w:lineRule="auto" w:line="276" w:before="0" w:after="0"/>
+      </w:pPr>
+      <w:r>
+        <w:rPr>
+          <w:rFonts w:ascii="Arial" w:hAnsi="Arial" w:cs="Arial" w:eastAsia="Arial"/>
+          <w:b w:val="0"/>
+          <w:color w:val="000000"/>
+          <w:sz w:val="36"/>
+        </w:rPr>
+      </w:r>
+    </w:p>
+    <w:p>
+      <w:pPr>
+        <w:spacing w:lineRule="auto" w:line="276" w:before="0" w:after="0"/>
+      </w:pPr>
+      <w:r>
+        <w:rPr>
+          <w:rFonts w:ascii="Arial" w:hAnsi="Arial" w:cs="Arial" w:eastAsia="Arial"/>
+          <w:b w:val="0"/>
+          <w:color w:val="000000"/>
+          <w:sz w:val="36"/>
+        </w:rPr>
+        <w:t xml:space="preserve">-BECAUSE THE </w:t>
+      </w:r>
+      <w:r>
+        <w:rPr>
+          <w:rFonts w:ascii="Arial" w:hAnsi="Arial" w:cs="Arial" w:eastAsia="Arial"/>
+          <w:b/>
+          <w:color w:val="000000"/>
+          <w:sz w:val="36"/>
+        </w:rPr>
+        <w:t>CHAIR</w:t>
+      </w:r>
+      <w:r>
+        <w:rPr>
+          <w:rFonts w:ascii="Arial" w:hAnsi="Arial" w:cs="Arial" w:eastAsia="Arial"/>
+          <w:b w:val="0"/>
+          <w:color w:val="000000"/>
+          <w:sz w:val="36"/>
+        </w:rPr>
+        <w:t xml:space="preserve"> IS WHERE THEY GET YOU. TAKE THE SAMPLE AND KEEP WALKING!!</w:t>
+      </w:r>
+    </w:p>
+    <w:p>
+      <w:pPr>
+        <w:spacing w:lineRule="auto" w:line="276" w:before="0" w:after="0"/>
+      </w:pPr>
+      <w:r>
+        <w:rPr>
+          <w:rFonts w:ascii="Arial" w:hAnsi="Arial" w:cs="Arial" w:eastAsia="Arial"/>
+          <w:b w:val="0"/>
+          <w:color w:val="000000"/>
+          <w:sz w:val="36"/>
+        </w:rPr>
+      </w:r>
+    </w:p>
+    <w:p>
+      <w:pPr>
+        <w:spacing w:lineRule="auto" w:line="276" w:before="0" w:after="0"/>
+      </w:pPr>
+      <w:r>
+        <w:rPr>
+          <w:rFonts w:ascii="Arial" w:hAnsi="Arial" w:cs="Arial" w:eastAsia="Arial"/>
+          <w:b w:val="0"/>
+          <w:color w:val="000000"/>
+          <w:sz w:val="36"/>
+        </w:rPr>
+        <w:t>JEFF: NUMBER THREE. SAY IT ALREADY HAPPENED. YOU GOT CHARGED, AND THE SIGN SAYS NO REFUNDS. HOW DO YOU GET YOUR MONEY BACK?</w:t>
+      </w:r>
+    </w:p>
+    <w:p>
+      <w:pPr>
+        <w:spacing w:lineRule="auto" w:line="276" w:before="0" w:after="0"/>
+      </w:pPr>
+      <w:r>
+        <w:rPr>
+          <w:rFonts w:ascii="Arial" w:hAnsi="Arial" w:cs="Arial" w:eastAsia="Arial"/>
+          <w:b w:val="0"/>
+          <w:color w:val="000000"/>
+          <w:sz w:val="36"/>
+        </w:rPr>
+      </w:r>
+    </w:p>
+    <w:p>
+      <w:pPr>
+        <w:spacing w:lineRule="auto" w:line="276" w:before="0" w:after="0"/>
+      </w:pPr>
+      <w:r>
+        <w:rPr>
+          <w:rFonts w:ascii="Arial" w:hAnsi="Arial" w:cs="Arial" w:eastAsia="Arial"/>
+          <w:b w:val="0"/>
+          <w:color w:val="000000"/>
+          <w:sz w:val="36"/>
+        </w:rPr>
+        <w:t xml:space="preserve">-AND DON'T WAIT. CALL YOUR BANK OR CARD COMPANY </w:t>
+      </w:r>
+      <w:r>
+        <w:rPr>
+          <w:rFonts w:ascii="Arial" w:hAnsi="Arial" w:cs="Arial" w:eastAsia="Arial"/>
+          <w:b/>
+          <w:color w:val="000000"/>
+          <w:sz w:val="36"/>
+        </w:rPr>
+        <w:t>THE SAME DAY</w:t>
+      </w:r>
+      <w:r>
+        <w:rPr>
+          <w:rFonts w:ascii="Arial" w:hAnsi="Arial" w:cs="Arial" w:eastAsia="Arial"/>
+          <w:b w:val="0"/>
+          <w:color w:val="000000"/>
+          <w:sz w:val="36"/>
+        </w:rPr>
+        <w:t>.</w:t>
+      </w:r>
+    </w:p>
+    <w:p>
+      <w:pPr>
+        <w:spacing w:lineRule="auto" w:line="276" w:before="0" w:after="0"/>
+      </w:pPr>
+      <w:r>
+        <w:rPr>
+          <w:rFonts w:ascii="Arial" w:hAnsi="Arial" w:cs="Arial" w:eastAsia="Arial"/>
+          <w:b w:val="0"/>
+          <w:color w:val="000000"/>
+          <w:sz w:val="36"/>
+        </w:rPr>
+      </w:r>
+    </w:p>
+    <w:p>
+      <w:pPr>
+        <w:spacing w:lineRule="auto" w:line="276" w:before="0" w:after="0"/>
+      </w:pPr>
+      <w:r>
+        <w:rPr>
+          <w:rFonts w:ascii="Arial" w:hAnsi="Arial" w:cs="Arial" w:eastAsia="Arial"/>
+          <w:b w:val="0"/>
+          <w:color w:val="000000"/>
+          <w:sz w:val="36"/>
+        </w:rPr>
+        <w:t xml:space="preserve">-IF YOU PAID WITH A </w:t>
+      </w:r>
+      <w:r>
+        <w:rPr>
+          <w:rFonts w:ascii="Arial" w:hAnsi="Arial" w:cs="Arial" w:eastAsia="Arial"/>
+          <w:b/>
+          <w:color w:val="000000"/>
+          <w:sz w:val="36"/>
+        </w:rPr>
+        <w:t>CREDIT CARD</w:t>
+      </w:r>
+      <w:r>
+        <w:rPr>
+          <w:rFonts w:ascii="Arial" w:hAnsi="Arial" w:cs="Arial" w:eastAsia="Arial"/>
+          <w:b w:val="0"/>
+          <w:color w:val="000000"/>
+          <w:sz w:val="36"/>
+        </w:rPr>
+        <w:t xml:space="preserve">, FEDERAL LAW GIVES YOU </w:t>
+      </w:r>
+      <w:r>
+        <w:rPr>
+          <w:rFonts w:ascii="Arial" w:hAnsi="Arial" w:cs="Arial" w:eastAsia="Arial"/>
+          <w:b/>
+          <w:color w:val="000000"/>
+          <w:sz w:val="36"/>
+        </w:rPr>
+        <w:t>60 DAYS</w:t>
+      </w:r>
+      <w:r>
+        <w:rPr>
+          <w:rFonts w:ascii="Arial" w:hAnsi="Arial" w:cs="Arial" w:eastAsia="Arial"/>
+          <w:b w:val="0"/>
+          <w:color w:val="000000"/>
+          <w:sz w:val="36"/>
+        </w:rPr>
+        <w:t xml:space="preserve"> FROM THE STATEMENT TO DISPUTE A BILLING ERROR, IN WRITING.</w:t>
+      </w:r>
+    </w:p>
+    <w:p>
+      <w:pPr>
+        <w:spacing w:lineRule="auto" w:line="276" w:before="0" w:after="0"/>
+      </w:pPr>
+      <w:r>
+        <w:rPr>
+          <w:rFonts w:ascii="Arial" w:hAnsi="Arial" w:cs="Arial" w:eastAsia="Arial"/>
+          <w:b w:val="0"/>
+          <w:color w:val="000000"/>
+          <w:sz w:val="36"/>
+        </w:rPr>
+      </w:r>
+    </w:p>
+    <w:p>
+      <w:pPr>
+        <w:spacing w:lineRule="auto" w:line="276" w:before="0" w:after="0"/>
+      </w:pPr>
+      <w:r>
+        <w:rPr>
+          <w:rFonts w:ascii="Arial" w:hAnsi="Arial" w:cs="Arial" w:eastAsia="Arial"/>
+          <w:b w:val="0"/>
+          <w:color w:val="000000"/>
+          <w:sz w:val="36"/>
+        </w:rPr>
+        <w:t xml:space="preserve">-THEN REPORT IT AT </w:t>
+      </w:r>
+      <w:r>
+        <w:rPr>
+          <w:rFonts w:ascii="Arial" w:hAnsi="Arial" w:cs="Arial" w:eastAsia="Arial"/>
+          <w:b/>
+          <w:color w:val="000000"/>
+          <w:sz w:val="36"/>
+        </w:rPr>
+        <w:t>REPORTFRAUD.FTC.GOV</w:t>
+      </w:r>
+      <w:r>
+        <w:rPr>
+          <w:rFonts w:ascii="Arial" w:hAnsi="Arial" w:cs="Arial" w:eastAsia="Arial"/>
+          <w:b w:val="0"/>
+          <w:color w:val="000000"/>
+          <w:sz w:val="36"/>
+        </w:rPr>
+        <w:t>. THERE IT IS ON THE SCREEN.</w:t>
       </w:r>
     </w:p>
     <w:p>
@@ -2021,19 +2169,80 @@
           <w:color w:val="FF0000"/>
           <w:sz w:val="36"/>
         </w:rPr>
-        <w:t>(((</w:t>
-      </w:r>
-      <w:hyperlink r:id="rId11">
-        <w:r>
-          <w:rPr>
-            <w:color w:val="1155CC"/>
-            <w:u w:val="single"/>
-            <w:rFonts w:ascii="Arial" w:hAnsi="Arial" w:cs="Arial"/>
-            <w:sz w:val="36"/>
-          </w:rPr>
-          <w:t xml:space="preserve">WCPO</w:t>
-        </w:r>
-      </w:hyperlink>
+        <w:t>(((INSERT GRAPHIC 003 - REPORTFRAUD.FTC.GOV)))</w:t>
+      </w:r>
+    </w:p>
+    <w:p>
+      <w:pPr>
+        <w:spacing w:lineRule="auto" w:line="276" w:before="0" w:after="0"/>
+      </w:pPr>
+      <w:r>
+        <w:rPr>
+          <w:rFonts w:ascii="Arial" w:hAnsi="Arial" w:cs="Arial" w:eastAsia="Arial"/>
+          <w:b w:val="0"/>
+          <w:color w:val="000000"/>
+          <w:sz w:val="36"/>
+        </w:rPr>
+      </w:r>
+    </w:p>
+    <w:p>
+      <w:pPr>
+        <w:spacing w:lineRule="auto" w:line="276" w:before="0" w:after="0"/>
+      </w:pPr>
+      <w:r>
+        <w:rPr>
+          <w:rFonts w:ascii="Arial" w:hAnsi="Arial" w:cs="Arial" w:eastAsia="Arial"/>
+          <w:b w:val="0"/>
+          <w:color w:val="000000"/>
+          <w:sz w:val="36"/>
+        </w:rPr>
+        <w:t>JEFF: NUMBER FOUR. THESE VICTIMS WERE TOO EMBARRASSED TO TELL ANYONE. HOW DO YOU TALK TO A LOVED ONE ABOUT THIS?</w:t>
+      </w:r>
+    </w:p>
+    <w:p>
+      <w:pPr>
+        <w:spacing w:lineRule="auto" w:line="276" w:before="0" w:after="0"/>
+      </w:pPr>
+      <w:r>
+        <w:rPr>
+          <w:rFonts w:ascii="Arial" w:hAnsi="Arial" w:cs="Arial" w:eastAsia="Arial"/>
+          <w:b w:val="0"/>
+          <w:color w:val="000000"/>
+          <w:sz w:val="36"/>
+        </w:rPr>
+      </w:r>
+    </w:p>
+    <w:p>
+      <w:pPr>
+        <w:spacing w:lineRule="auto" w:line="276" w:before="0" w:after="0"/>
+      </w:pPr>
+      <w:r>
+        <w:rPr>
+          <w:rFonts w:ascii="Arial" w:hAnsi="Arial" w:cs="Arial" w:eastAsia="Arial"/>
+          <w:b w:val="0"/>
+          <w:color w:val="000000"/>
+          <w:sz w:val="36"/>
+        </w:rPr>
+        <w:t>JEFF: TERESA, THANK YOU.</w:t>
+      </w:r>
+    </w:p>
+    <w:p>
+      <w:pPr>
+        <w:spacing w:lineRule="auto" w:line="276" w:before="0" w:after="0"/>
+      </w:pPr>
+      <w:r>
+        <w:rPr>
+          <w:rFonts w:ascii="Arial" w:hAnsi="Arial" w:cs="Arial" w:eastAsia="Arial"/>
+          <w:b w:val="0"/>
+          <w:color w:val="000000"/>
+          <w:sz w:val="36"/>
+        </w:rPr>
+      </w:r>
+    </w:p>
+    <w:p>
+      <w:pPr>
+        <w:spacing w:lineRule="auto" w:line="276" w:before="0" w:after="0"/>
+      </w:pPr>
       <w:r>
         <w:rPr>
           <w:rFonts w:ascii="Arial" w:hAnsi="Arial" w:cs="Arial" w:eastAsia="Arial"/>
@@ -2041,7 +2250,7 @@
           <w:color w:val="FF0000"/>
           <w:sz w:val="36"/>
         </w:rPr>
-        <w:t>)))</w:t>
+        <w:t>(((TERESA EXITS)))</w:t>
       </w:r>
     </w:p>
     <w:p>
@@ -2068,178 +2277,88 @@
           <w:color w:val="FF0000"/>
           <w:sz w:val="36"/>
         </w:rPr>
-        <w:t>(((PRODUCER - CLIP 3 IS NOT LOCKED. THE ONLY PACKAGE FOUND IS WCPO FROM 2019, ON A NEWS SITE. IF THE SCRAPER FINDS A NEWER VICTIM, SWAP IT IN. IF WE KEEP 2019, JEFF SAYS "A FEW YEARS AGO.")))</w:t>
-      </w:r>
-    </w:p>
-    <w:p>
-      <w:pPr>
-        <w:spacing w:lineRule="auto" w:line="276" w:before="0" w:after="0"/>
-      </w:pPr>
-      <w:r>
-        <w:rPr>
-          <w:rFonts w:ascii="Arial" w:hAnsi="Arial" w:cs="Arial" w:eastAsia="Arial"/>
-          <w:b w:val="0"/>
-          <w:color w:val="000000"/>
-          <w:sz w:val="36"/>
-        </w:rPr>
-      </w:r>
-    </w:p>
-    <w:p>
-      <w:pPr>
-        <w:spacing w:lineRule="auto" w:line="276" w:before="0" w:after="0"/>
-      </w:pPr>
-      <w:r>
-        <w:rPr>
-          <w:rFonts w:ascii="Arial" w:hAnsi="Arial" w:cs="Arial" w:eastAsia="Arial"/>
-          <w:b w:val="0"/>
-          <w:color w:val="000000"/>
-          <w:sz w:val="36"/>
-        </w:rPr>
-        <w:t xml:space="preserve">-THE FORM SHE SIGNED SAID THE COMPANY WAS </w:t>
-      </w:r>
-      <w:r>
-        <w:rPr>
-          <w:rFonts w:ascii="Arial" w:hAnsi="Arial" w:cs="Arial" w:eastAsia="Arial"/>
-          <w:b/>
-          <w:color w:val="000000"/>
-          <w:sz w:val="36"/>
-        </w:rPr>
-        <w:t>NOT LIABLE</w:t>
-      </w:r>
-      <w:r>
-        <w:rPr>
-          <w:rFonts w:ascii="Arial" w:hAnsi="Arial" w:cs="Arial" w:eastAsia="Arial"/>
-          <w:b w:val="0"/>
-          <w:color w:val="000000"/>
-          <w:sz w:val="36"/>
-        </w:rPr>
-        <w:t xml:space="preserve"> FOR DAMAGE DURING THE REPAIR.</w:t>
-      </w:r>
-    </w:p>
-    <w:p>
-      <w:pPr>
-        <w:spacing w:lineRule="auto" w:line="276" w:before="0" w:after="0"/>
-      </w:pPr>
-      <w:r>
-        <w:rPr>
-          <w:rFonts w:ascii="Arial" w:hAnsi="Arial" w:cs="Arial" w:eastAsia="Arial"/>
-          <w:b w:val="0"/>
-          <w:color w:val="000000"/>
-          <w:sz w:val="36"/>
-        </w:rPr>
-      </w:r>
-    </w:p>
-    <w:p>
-      <w:pPr>
-        <w:spacing w:lineRule="auto" w:line="276" w:before="0" w:after="0"/>
-      </w:pPr>
-      <w:r>
-        <w:rPr>
-          <w:rFonts w:ascii="Arial" w:hAnsi="Arial" w:cs="Arial" w:eastAsia="Arial"/>
-          <w:b w:val="0"/>
-          <w:color w:val="000000"/>
-          <w:sz w:val="36"/>
-        </w:rPr>
-        <w:t>-SO IF THEY BREAK IT… IT'S YOUR PROBLEM!!</w:t>
-      </w:r>
-    </w:p>
-    <w:p>
-      <w:pPr>
-        <w:spacing w:lineRule="auto" w:line="276" w:before="0" w:after="0"/>
-      </w:pPr>
-      <w:r>
-        <w:rPr>
-          <w:rFonts w:ascii="Arial" w:hAnsi="Arial" w:cs="Arial" w:eastAsia="Arial"/>
-          <w:b w:val="0"/>
-          <w:color w:val="000000"/>
-          <w:sz w:val="36"/>
-        </w:rPr>
-      </w:r>
-    </w:p>
-    <w:p>
-      <w:pPr>
-        <w:spacing w:lineRule="auto" w:line="276" w:before="0" w:after="0"/>
-      </w:pPr>
-      <w:r>
-        <w:rPr>
-          <w:rFonts w:ascii="Arial" w:hAnsi="Arial" w:cs="Arial" w:eastAsia="Arial"/>
-          <w:b/>
-          <w:color w:val="000000"/>
-          <w:sz w:val="46"/>
-        </w:rPr>
-        <w:t>SO HOW DO YOU WALK AWAY… BEFORE YOU EVER SIT DOWN?</w:t>
-      </w:r>
-    </w:p>
-    <w:p>
-      <w:pPr>
-        <w:spacing w:lineRule="auto" w:line="276" w:before="0" w:after="0"/>
-      </w:pPr>
-      <w:r>
-        <w:rPr>
-          <w:rFonts w:ascii="Arial" w:hAnsi="Arial" w:cs="Arial" w:eastAsia="Arial"/>
-          <w:b w:val="0"/>
-          <w:color w:val="000000"/>
-          <w:sz w:val="36"/>
-        </w:rPr>
-      </w:r>
-    </w:p>
-    <w:p>
-      <w:pPr>
-        <w:spacing w:lineRule="auto" w:line="276" w:before="0" w:after="0"/>
-      </w:pPr>
-      <w:r>
-        <w:rPr>
-          <w:rFonts w:ascii="Arial" w:hAnsi="Arial" w:cs="Arial" w:eastAsia="Arial"/>
-          <w:b w:val="0"/>
-          <w:color w:val="000000"/>
-          <w:sz w:val="36"/>
-        </w:rPr>
-        <w:t xml:space="preserve">-I WANT TO BRING IN </w:t>
-      </w:r>
-      <w:r>
-        <w:rPr>
-          <w:rFonts w:ascii="Arial" w:hAnsi="Arial" w:cs="Arial" w:eastAsia="Arial"/>
-          <w:b/>
-          <w:color w:val="000000"/>
-          <w:sz w:val="36"/>
-        </w:rPr>
-        <w:t>TERESA MURRAY</w:t>
-      </w:r>
-      <w:r>
-        <w:rPr>
-          <w:rFonts w:ascii="Arial" w:hAnsi="Arial" w:cs="Arial" w:eastAsia="Arial"/>
-          <w:b w:val="0"/>
-          <w:color w:val="000000"/>
-          <w:sz w:val="36"/>
-        </w:rPr>
-        <w:t>. SHE RUNS THE CONSUMER WATCHDOG OFFICE AT THE U.S. PIRG EDUCATION FUND.</w:t>
-      </w:r>
-    </w:p>
-    <w:p>
-      <w:pPr>
-        <w:spacing w:lineRule="auto" w:line="276" w:before="0" w:after="0"/>
-      </w:pPr>
-      <w:r>
-        <w:rPr>
-          <w:rFonts w:ascii="Arial" w:hAnsi="Arial" w:cs="Arial" w:eastAsia="Arial"/>
-          <w:b w:val="0"/>
-          <w:color w:val="000000"/>
-          <w:sz w:val="36"/>
-        </w:rPr>
-      </w:r>
-    </w:p>
-    <w:p>
-      <w:pPr>
-        <w:spacing w:lineRule="auto" w:line="276" w:before="0" w:after="0"/>
-      </w:pPr>
-      <w:r>
-        <w:rPr>
-          <w:rFonts w:ascii="Arial" w:hAnsi="Arial" w:cs="Arial" w:eastAsia="Arial"/>
-          <w:b w:val="0"/>
-          <w:color w:val="000000"/>
-          <w:sz w:val="36"/>
-        </w:rPr>
-        <w:t>-SHE SPENT TWO DECADES AS A CONSUMER REPORTER… AND NOW SHE TRACKS SCAMS LIKE THESE FOR A LIVING.</w:t>
+        <w:t>(((PRODUCER - CONFIRM TERESA HAS NO TIES TO ANY SPONSOR. THE U.S. PIRG EDUCATION FUND IS A NONPROFIT; IF THERE'S A TIE, JEFF DISCLOSES IT WHEN HE BRINGS HER IN.)))</w:t>
+      </w:r>
+    </w:p>
+    <w:p>
+      <w:pPr>
+        <w:spacing w:lineRule="auto" w:line="276" w:before="0" w:after="0"/>
+      </w:pPr>
+      <w:r>
+        <w:rPr>
+          <w:rFonts w:ascii="Arial" w:hAnsi="Arial" w:cs="Arial" w:eastAsia="Arial"/>
+          <w:b w:val="0"/>
+          <w:color w:val="000000"/>
+          <w:sz w:val="36"/>
+        </w:rPr>
+      </w:r>
+    </w:p>
+    <w:p>
+      <w:pPr>
+        <w:spacing w:lineRule="auto" w:line="276" w:before="0" w:after="0"/>
+      </w:pPr>
+      <w:r>
+        <w:rPr>
+          <w:rFonts w:ascii="Arial" w:hAnsi="Arial" w:cs="Arial" w:eastAsia="Arial"/>
+          <w:b w:val="0"/>
+          <w:color w:val="000000"/>
+          <w:sz w:val="36"/>
+        </w:rPr>
+        <w:t>-AND TALK TO YOUR FAMILY. THESE VICTIMS WERE TOO EMBARRASSED TO TELL ANYONE.</w:t>
+      </w:r>
+    </w:p>
+    <w:p>
+      <w:pPr>
+        <w:spacing w:lineRule="auto" w:line="276" w:before="0" w:after="0"/>
+      </w:pPr>
+      <w:r>
+        <w:rPr>
+          <w:rFonts w:ascii="Arial" w:hAnsi="Arial" w:cs="Arial" w:eastAsia="Arial"/>
+          <w:b w:val="0"/>
+          <w:color w:val="000000"/>
+          <w:sz w:val="36"/>
+        </w:rPr>
+      </w:r>
+    </w:p>
+    <w:p>
+      <w:pPr>
+        <w:spacing w:lineRule="auto" w:line="276" w:before="0" w:after="0"/>
+      </w:pPr>
+      <w:r>
+        <w:rPr>
+          <w:rFonts w:ascii="Arial" w:hAnsi="Arial" w:cs="Arial" w:eastAsia="Arial"/>
+          <w:b w:val="0"/>
+          <w:color w:val="000000"/>
+          <w:sz w:val="36"/>
+        </w:rPr>
+        <w:t>-NEXT, THE CAREGIVER WHO ENDED UP OWNING A MAN'S HOUSE… FOR FIVE DOLLARS!!</w:t>
+      </w:r>
+    </w:p>
+    <w:p>
+      <w:pPr>
+        <w:spacing w:lineRule="auto" w:line="276" w:before="0" w:after="0"/>
+      </w:pPr>
+      <w:r>
+        <w:rPr>
+          <w:rFonts w:ascii="Arial" w:hAnsi="Arial" w:cs="Arial" w:eastAsia="Arial"/>
+          <w:b w:val="0"/>
+          <w:color w:val="000000"/>
+          <w:sz w:val="36"/>
+        </w:rPr>
+      </w:r>
+    </w:p>
+    <w:p>
+      <w:pPr>
+        <w:spacing w:lineRule="auto" w:line="276" w:before="0" w:after="0"/>
+      </w:pPr>
+      <w:r>
+        <w:rPr>
+          <w:rFonts w:ascii="Arial" w:hAnsi="Arial" w:cs="Arial" w:eastAsia="Arial"/>
+          <w:b w:val="0"/>
+          <w:color w:val="000000"/>
+          <w:sz w:val="36"/>
+        </w:rPr>
+        <w:t>-BUT FIRST, A QUICK WORD FROM OUR SPONSOR.</w:t>
       </w:r>
     </w:p>
     <w:p>
@@ -2266,7 +2385,7 @@
           <w:color w:val="FF0000"/>
           <w:sz w:val="36"/>
         </w:rPr>
-        <w:t>(((BRING IN TERESA)))</w:t>
+        <w:t>(((SPONSOR TEASE - KILL BANNERS)))</w:t>
       </w:r>
     </w:p>
     <w:p>
@@ -2293,187 +2412,88 @@
           <w:color w:val="FF0000"/>
           <w:sz w:val="36"/>
         </w:rPr>
-        <w:t>(((JEFF - KEEP TERESA ON THE TACTICS, NOT BH28 OR THE PEOPLE IN THE CLIPS. THE BH28 CASE IS STILL OPEN.)))</w:t>
-      </w:r>
-    </w:p>
-    <w:p>
-      <w:pPr>
-        <w:spacing w:lineRule="auto" w:line="276" w:before="0" w:after="0"/>
-      </w:pPr>
-      <w:r>
-        <w:rPr>
-          <w:rFonts w:ascii="Arial" w:hAnsi="Arial" w:cs="Arial" w:eastAsia="Arial"/>
-          <w:b w:val="0"/>
-          <w:color w:val="000000"/>
-          <w:sz w:val="36"/>
-        </w:rPr>
-      </w:r>
-    </w:p>
-    <w:p>
-      <w:pPr>
-        <w:spacing w:lineRule="auto" w:line="276" w:before="0" w:after="0"/>
-      </w:pPr>
-      <w:r>
-        <w:rPr>
-          <w:rFonts w:ascii="Arial" w:hAnsi="Arial" w:cs="Arial" w:eastAsia="Arial"/>
-          <w:b w:val="0"/>
-          <w:color w:val="000000"/>
-          <w:sz w:val="36"/>
-        </w:rPr>
-        <w:t>JEFF: TERESA, WHAT'S GOING ON? LET'S GET RIGHT TO IT.</w:t>
-      </w:r>
-    </w:p>
-    <w:p>
-      <w:pPr>
-        <w:spacing w:lineRule="auto" w:line="276" w:before="0" w:after="0"/>
-      </w:pPr>
-      <w:r>
-        <w:rPr>
-          <w:rFonts w:ascii="Arial" w:hAnsi="Arial" w:cs="Arial" w:eastAsia="Arial"/>
-          <w:b w:val="0"/>
-          <w:color w:val="000000"/>
-          <w:sz w:val="36"/>
-        </w:rPr>
-      </w:r>
-    </w:p>
-    <w:p>
-      <w:pPr>
-        <w:spacing w:lineRule="auto" w:line="276" w:before="0" w:after="0"/>
-      </w:pPr>
-      <w:r>
-        <w:rPr>
-          <w:rFonts w:ascii="Arial" w:hAnsi="Arial" w:cs="Arial" w:eastAsia="Arial"/>
-          <w:b w:val="0"/>
-          <w:color w:val="000000"/>
-          <w:sz w:val="36"/>
-        </w:rPr>
-        <w:t>JEFF: NUMBER ONE. HOW DO THESE MALL KIOSKS PULL YOU IN? THE SAMPLE… THE COMPLIMENT… THE CHAIR?</w:t>
-      </w:r>
-    </w:p>
-    <w:p>
-      <w:pPr>
-        <w:spacing w:lineRule="auto" w:line="276" w:before="0" w:after="0"/>
-      </w:pPr>
-      <w:r>
-        <w:rPr>
-          <w:rFonts w:ascii="Arial" w:hAnsi="Arial" w:cs="Arial" w:eastAsia="Arial"/>
-          <w:b w:val="0"/>
-          <w:color w:val="000000"/>
-          <w:sz w:val="36"/>
-        </w:rPr>
-      </w:r>
-    </w:p>
-    <w:p>
-      <w:pPr>
-        <w:spacing w:lineRule="auto" w:line="276" w:before="0" w:after="0"/>
-      </w:pPr>
-      <w:r>
-        <w:rPr>
-          <w:rFonts w:ascii="Arial" w:hAnsi="Arial" w:cs="Arial" w:eastAsia="Arial"/>
-          <w:b w:val="0"/>
-          <w:color w:val="000000"/>
-          <w:sz w:val="36"/>
-        </w:rPr>
-        <w:t>JEFF: NUMBER TWO. SOMEONE STEPS OUT WITH A SAMPLE. WHAT DO YOU ACTUALLY SAY TO WALK AWAY?</w:t>
-      </w:r>
-    </w:p>
-    <w:p>
-      <w:pPr>
-        <w:spacing w:lineRule="auto" w:line="276" w:before="0" w:after="0"/>
-      </w:pPr>
-      <w:r>
-        <w:rPr>
-          <w:rFonts w:ascii="Arial" w:hAnsi="Arial" w:cs="Arial" w:eastAsia="Arial"/>
-          <w:b w:val="0"/>
-          <w:color w:val="000000"/>
-          <w:sz w:val="36"/>
-        </w:rPr>
-      </w:r>
-    </w:p>
-    <w:p>
-      <w:pPr>
-        <w:spacing w:lineRule="auto" w:line="276" w:before="0" w:after="0"/>
-      </w:pPr>
-      <w:r>
-        <w:rPr>
-          <w:rFonts w:ascii="Arial" w:hAnsi="Arial" w:cs="Arial" w:eastAsia="Arial"/>
-          <w:b w:val="0"/>
-          <w:color w:val="000000"/>
-          <w:sz w:val="36"/>
-        </w:rPr>
-        <w:t xml:space="preserve">-BECAUSE THE </w:t>
-      </w:r>
+        <w:t>(((OMNIWATCH SPOT)))</w:t>
+      </w:r>
+    </w:p>
+    <w:p>
+      <w:pPr>
+        <w:spacing w:lineRule="auto" w:line="276" w:before="0" w:after="0"/>
+      </w:pPr>
+      <w:r>
+        <w:rPr>
+          <w:rFonts w:ascii="Arial" w:hAnsi="Arial" w:cs="Arial" w:eastAsia="Arial"/>
+          <w:b w:val="0"/>
+          <w:color w:val="000000"/>
+          <w:sz w:val="36"/>
+        </w:rPr>
+      </w:r>
+    </w:p>
+    <w:p>
+      <w:pPr>
+        <w:spacing w:lineRule="auto" w:line="276" w:before="0" w:after="0"/>
+      </w:pPr>
       <w:r>
         <w:rPr>
           <w:rFonts w:ascii="Arial" w:hAnsi="Arial" w:cs="Arial" w:eastAsia="Arial"/>
           <w:b/>
           <w:color w:val="000000"/>
-          <w:sz w:val="36"/>
-        </w:rPr>
-        <w:t>CHAIR</w:t>
-      </w:r>
-      <w:r>
-        <w:rPr>
-          <w:rFonts w:ascii="Arial" w:hAnsi="Arial" w:cs="Arial" w:eastAsia="Arial"/>
-          <w:b w:val="0"/>
-          <w:color w:val="000000"/>
-          <w:sz w:val="36"/>
-        </w:rPr>
-        <w:t xml:space="preserve"> IS WHERE THEY GET YOU. TAKE THE SAMPLE AND KEEP WALKING!!</w:t>
-      </w:r>
-    </w:p>
-    <w:p>
-      <w:pPr>
-        <w:spacing w:lineRule="auto" w:line="276" w:before="0" w:after="0"/>
-      </w:pPr>
-      <w:r>
-        <w:rPr>
-          <w:rFonts w:ascii="Arial" w:hAnsi="Arial" w:cs="Arial" w:eastAsia="Arial"/>
-          <w:b w:val="0"/>
-          <w:color w:val="000000"/>
-          <w:sz w:val="36"/>
-        </w:rPr>
-      </w:r>
-    </w:p>
-    <w:p>
-      <w:pPr>
-        <w:spacing w:lineRule="auto" w:line="276" w:before="0" w:after="0"/>
-      </w:pPr>
-      <w:r>
-        <w:rPr>
-          <w:rFonts w:ascii="Arial" w:hAnsi="Arial" w:cs="Arial" w:eastAsia="Arial"/>
-          <w:b w:val="0"/>
-          <w:color w:val="000000"/>
-          <w:sz w:val="36"/>
-        </w:rPr>
-        <w:t>JEFF: NUMBER THREE. SAY IT ALREADY HAPPENED. YOU GOT CHARGED, AND THE SIGN SAYS NO REFUNDS. HOW DO YOU GET YOUR MONEY BACK?</w:t>
-      </w:r>
-    </w:p>
-    <w:p>
-      <w:pPr>
-        <w:spacing w:lineRule="auto" w:line="276" w:before="0" w:after="0"/>
-      </w:pPr>
-      <w:r>
-        <w:rPr>
-          <w:rFonts w:ascii="Arial" w:hAnsi="Arial" w:cs="Arial" w:eastAsia="Arial"/>
-          <w:b w:val="0"/>
-          <w:color w:val="000000"/>
-          <w:sz w:val="36"/>
-        </w:rPr>
-      </w:r>
-    </w:p>
-    <w:p>
-      <w:pPr>
-        <w:spacing w:lineRule="auto" w:line="276" w:before="0" w:after="0"/>
-      </w:pPr>
-      <w:r>
-        <w:rPr>
-          <w:rFonts w:ascii="Arial" w:hAnsi="Arial" w:cs="Arial" w:eastAsia="Arial"/>
-          <w:b w:val="0"/>
-          <w:color w:val="000000"/>
-          <w:sz w:val="36"/>
-        </w:rPr>
-        <w:t xml:space="preserve">-AND DON'T WAIT. CALL YOUR BANK OR CARD COMPANY </w:t>
+          <w:sz w:val="46"/>
+        </w:rPr>
+        <w:t>YOU HIRE SOMEONE TO TAKE CARE OF YOUR DAD… AND THEY END UP WITH HIS HOUSE</w:t>
+      </w:r>
+    </w:p>
+    <w:p>
+      <w:pPr>
+        <w:spacing w:lineRule="auto" w:line="276" w:before="0" w:after="0"/>
+      </w:pPr>
+      <w:r>
+        <w:rPr>
+          <w:rFonts w:ascii="Arial" w:hAnsi="Arial" w:cs="Arial" w:eastAsia="Arial"/>
+          <w:b w:val="0"/>
+          <w:color w:val="000000"/>
+          <w:sz w:val="36"/>
+        </w:rPr>
+      </w:r>
+    </w:p>
+    <w:p>
+      <w:pPr>
+        <w:spacing w:lineRule="auto" w:line="276" w:before="0" w:after="0"/>
+      </w:pPr>
+      <w:r>
+        <w:rPr>
+          <w:rFonts w:ascii="Arial" w:hAnsi="Arial" w:cs="Arial" w:eastAsia="Arial"/>
+          <w:b w:val="0"/>
+          <w:color w:val="000000"/>
+          <w:sz w:val="36"/>
+        </w:rPr>
+        <w:t>-THEY'RE IN THE HOUSE EVERY DAY. THEY HELP WITH THE PILLS, THE MAIL, THE BILLS.</w:t>
+      </w:r>
+    </w:p>
+    <w:p>
+      <w:pPr>
+        <w:spacing w:lineRule="auto" w:line="276" w:before="0" w:after="0"/>
+      </w:pPr>
+      <w:r>
+        <w:rPr>
+          <w:rFonts w:ascii="Arial" w:hAnsi="Arial" w:cs="Arial" w:eastAsia="Arial"/>
+          <w:b w:val="0"/>
+          <w:color w:val="000000"/>
+          <w:sz w:val="36"/>
+        </w:rPr>
+      </w:r>
+    </w:p>
+    <w:p>
+      <w:pPr>
+        <w:spacing w:lineRule="auto" w:line="276" w:before="0" w:after="0"/>
+      </w:pPr>
+      <w:r>
+        <w:rPr>
+          <w:rFonts w:ascii="Arial" w:hAnsi="Arial" w:cs="Arial" w:eastAsia="Arial"/>
+          <w:b w:val="0"/>
+          <w:color w:val="000000"/>
+          <w:sz w:val="36"/>
+        </w:rPr>
+        <w:t xml:space="preserve">-NOW IMAGINE FINDING OUT THEY HAVE HIS </w:t>
       </w:r>
       <w:r>
         <w:rPr>
@@ -2482,7 +2502,178 @@
           <w:color w:val="000000"/>
           <w:sz w:val="36"/>
         </w:rPr>
-        <w:t>THE SAME DAY</w:t>
+        <w:t>POWER OF ATTORNEY</w:t>
+      </w:r>
+      <w:r>
+        <w:rPr>
+          <w:rFonts w:ascii="Arial" w:hAnsi="Arial" w:cs="Arial" w:eastAsia="Arial"/>
+          <w:b w:val="0"/>
+          <w:color w:val="000000"/>
+          <w:sz w:val="36"/>
+        </w:rPr>
+        <w:t>… AND HIS HOUSE.</w:t>
+      </w:r>
+    </w:p>
+    <w:p>
+      <w:pPr>
+        <w:spacing w:lineRule="auto" w:line="276" w:before="0" w:after="0"/>
+      </w:pPr>
+      <w:r>
+        <w:rPr>
+          <w:rFonts w:ascii="Arial" w:hAnsi="Arial" w:cs="Arial" w:eastAsia="Arial"/>
+          <w:b w:val="0"/>
+          <w:color w:val="000000"/>
+          <w:sz w:val="36"/>
+        </w:rPr>
+      </w:r>
+    </w:p>
+    <w:p>
+      <w:pPr>
+        <w:spacing w:lineRule="auto" w:line="276" w:before="0" w:after="0"/>
+      </w:pPr>
+      <w:r>
+        <w:rPr>
+          <w:rFonts w:ascii="Arial" w:hAnsi="Arial" w:cs="Arial" w:eastAsia="Arial"/>
+          <w:b w:val="0"/>
+          <w:color w:val="000000"/>
+          <w:sz w:val="36"/>
+        </w:rPr>
+        <w:t>-THAT'S THE PIECE OF PAPER. AND WE FOUND THREE FAMILIES IT HAPPENED TO.</w:t>
+      </w:r>
+    </w:p>
+    <w:p>
+      <w:pPr>
+        <w:spacing w:lineRule="auto" w:line="276" w:before="0" w:after="0"/>
+      </w:pPr>
+      <w:r>
+        <w:rPr>
+          <w:rFonts w:ascii="Arial" w:hAnsi="Arial" w:cs="Arial" w:eastAsia="Arial"/>
+          <w:b w:val="0"/>
+          <w:color w:val="000000"/>
+          <w:sz w:val="36"/>
+        </w:rPr>
+      </w:r>
+    </w:p>
+    <w:p>
+      <w:pPr>
+        <w:spacing w:lineRule="auto" w:line="276" w:before="0" w:after="0"/>
+      </w:pPr>
+      <w:r>
+        <w:rPr>
+          <w:rFonts w:ascii="Arial" w:hAnsi="Arial" w:cs="Arial" w:eastAsia="Arial"/>
+          <w:b/>
+          <w:color w:val="000000"/>
+          <w:sz w:val="46"/>
+        </w:rPr>
+        <w:t>SHE DROVE SEVEN HOURS TO CHECK ON HER DAD… AND THE CAREGIVER HAD HIS HOUSE!!</w:t>
+      </w:r>
+    </w:p>
+    <w:p>
+      <w:pPr>
+        <w:spacing w:lineRule="auto" w:line="276" w:before="0" w:after="0"/>
+      </w:pPr>
+      <w:r>
+        <w:rPr>
+          <w:rFonts w:ascii="Arial" w:hAnsi="Arial" w:cs="Arial" w:eastAsia="Arial"/>
+          <w:b w:val="0"/>
+          <w:color w:val="000000"/>
+          <w:sz w:val="36"/>
+        </w:rPr>
+      </w:r>
+    </w:p>
+    <w:p>
+      <w:pPr>
+        <w:spacing w:lineRule="auto" w:line="276" w:before="0" w:after="0"/>
+      </w:pPr>
+      <w:r>
+        <w:rPr>
+          <w:rFonts w:ascii="Arial" w:hAnsi="Arial" w:cs="Arial" w:eastAsia="Arial"/>
+          <w:b w:val="0"/>
+          <w:color w:val="000000"/>
+          <w:sz w:val="36"/>
+        </w:rPr>
+        <w:t xml:space="preserve">-NORA'S DAD, BOB, HAD </w:t>
+      </w:r>
+      <w:r>
+        <w:rPr>
+          <w:rFonts w:ascii="Arial" w:hAnsi="Arial" w:cs="Arial" w:eastAsia="Arial"/>
+          <w:b/>
+          <w:color w:val="000000"/>
+          <w:sz w:val="36"/>
+        </w:rPr>
+        <w:t>PARKINSON'S</w:t>
+      </w:r>
+      <w:r>
+        <w:rPr>
+          <w:rFonts w:ascii="Arial" w:hAnsi="Arial" w:cs="Arial" w:eastAsia="Arial"/>
+          <w:b w:val="0"/>
+          <w:color w:val="000000"/>
+          <w:sz w:val="36"/>
+        </w:rPr>
+        <w:t xml:space="preserve"> AND A BRAIN INJURY.</w:t>
+      </w:r>
+    </w:p>
+    <w:p>
+      <w:pPr>
+        <w:spacing w:lineRule="auto" w:line="276" w:before="0" w:after="0"/>
+      </w:pPr>
+      <w:r>
+        <w:rPr>
+          <w:rFonts w:ascii="Arial" w:hAnsi="Arial" w:cs="Arial" w:eastAsia="Arial"/>
+          <w:b w:val="0"/>
+          <w:color w:val="000000"/>
+          <w:sz w:val="36"/>
+        </w:rPr>
+      </w:r>
+    </w:p>
+    <w:p>
+      <w:pPr>
+        <w:spacing w:lineRule="auto" w:line="276" w:before="0" w:after="0"/>
+      </w:pPr>
+      <w:r>
+        <w:rPr>
+          <w:rFonts w:ascii="Arial" w:hAnsi="Arial" w:cs="Arial" w:eastAsia="Arial"/>
+          <w:b w:val="0"/>
+          <w:color w:val="000000"/>
+          <w:sz w:val="36"/>
+        </w:rPr>
+        <w:t>-SHE LIVED SEVEN HOURS AWAY, SO SHE HIRED IN-HOME HELP.</w:t>
+      </w:r>
+    </w:p>
+    <w:p>
+      <w:pPr>
+        <w:spacing w:lineRule="auto" w:line="276" w:before="0" w:after="0"/>
+      </w:pPr>
+      <w:r>
+        <w:rPr>
+          <w:rFonts w:ascii="Arial" w:hAnsi="Arial" w:cs="Arial" w:eastAsia="Arial"/>
+          <w:b w:val="0"/>
+          <w:color w:val="000000"/>
+          <w:sz w:val="36"/>
+        </w:rPr>
+      </w:r>
+    </w:p>
+    <w:p>
+      <w:pPr>
+        <w:spacing w:lineRule="auto" w:line="276" w:before="0" w:after="0"/>
+      </w:pPr>
+      <w:r>
+        <w:rPr>
+          <w:rFonts w:ascii="Arial" w:hAnsi="Arial" w:cs="Arial" w:eastAsia="Arial"/>
+          <w:b w:val="0"/>
+          <w:color w:val="000000"/>
+          <w:sz w:val="36"/>
+        </w:rPr>
+        <w:t xml:space="preserve">-THEN HE STOPPED ANSWERING HER CALLS. EVEN ON </w:t>
+      </w:r>
+      <w:r>
+        <w:rPr>
+          <w:rFonts w:ascii="Arial" w:hAnsi="Arial" w:cs="Arial" w:eastAsia="Arial"/>
+          <w:b/>
+          <w:color w:val="000000"/>
+          <w:sz w:val="36"/>
+        </w:rPr>
+        <w:t>FATHER'S DAY</w:t>
       </w:r>
       <w:r>
         <w:rPr>
@@ -2518,7 +2709,7 @@
           <w:color w:val="000000"/>
           <w:sz w:val="36"/>
         </w:rPr>
-        <w:t xml:space="preserve">-IF YOU PAID WITH A </w:t>
+        <w:t xml:space="preserve">-SO SHE DROVE DOWN. THERE WAS A NEW </w:t>
       </w:r>
       <w:r>
         <w:rPr>
@@ -2527,79 +2718,97 @@
           <w:color w:val="000000"/>
           <w:sz w:val="36"/>
         </w:rPr>
-        <w:t>CREDIT CARD</w:t>
-      </w:r>
-      <w:r>
-        <w:rPr>
-          <w:rFonts w:ascii="Arial" w:hAnsi="Arial" w:cs="Arial" w:eastAsia="Arial"/>
-          <w:b w:val="0"/>
-          <w:color w:val="000000"/>
-          <w:sz w:val="36"/>
-        </w:rPr>
-        <w:t xml:space="preserve">, FEDERAL LAW GIVES YOU </w:t>
-      </w:r>
-      <w:r>
-        <w:rPr>
-          <w:rFonts w:ascii="Arial" w:hAnsi="Arial" w:cs="Arial" w:eastAsia="Arial"/>
-          <w:b/>
-          <w:color w:val="000000"/>
-          <w:sz w:val="36"/>
-        </w:rPr>
-        <w:t>60 DAYS</w:t>
-      </w:r>
-      <w:r>
-        <w:rPr>
-          <w:rFonts w:ascii="Arial" w:hAnsi="Arial" w:cs="Arial" w:eastAsia="Arial"/>
-          <w:b w:val="0"/>
-          <w:color w:val="000000"/>
-          <w:sz w:val="36"/>
-        </w:rPr>
-        <w:t xml:space="preserve"> FROM THE STATEMENT TO DISPUTE A BILLING ERROR, IN WRITING.</w:t>
-      </w:r>
-    </w:p>
-    <w:p>
-      <w:pPr>
-        <w:spacing w:lineRule="auto" w:line="276" w:before="0" w:after="0"/>
-      </w:pPr>
-      <w:r>
-        <w:rPr>
-          <w:rFonts w:ascii="Arial" w:hAnsi="Arial" w:cs="Arial" w:eastAsia="Arial"/>
-          <w:b w:val="0"/>
-          <w:color w:val="000000"/>
-          <w:sz w:val="36"/>
-        </w:rPr>
-      </w:r>
-    </w:p>
-    <w:p>
-      <w:pPr>
-        <w:spacing w:lineRule="auto" w:line="276" w:before="0" w:after="0"/>
-      </w:pPr>
-      <w:r>
-        <w:rPr>
-          <w:rFonts w:ascii="Arial" w:hAnsi="Arial" w:cs="Arial" w:eastAsia="Arial"/>
-          <w:b w:val="0"/>
-          <w:color w:val="000000"/>
-          <w:sz w:val="36"/>
-        </w:rPr>
-        <w:t xml:space="preserve">-THEN REPORT IT AT </w:t>
-      </w:r>
-      <w:r>
-        <w:rPr>
-          <w:rFonts w:ascii="Arial" w:hAnsi="Arial" w:cs="Arial" w:eastAsia="Arial"/>
-          <w:b/>
-          <w:color w:val="000000"/>
-          <w:sz w:val="36"/>
-        </w:rPr>
-        <w:t>REPORTFRAUD.FTC.GOV</w:t>
-      </w:r>
-      <w:r>
-        <w:rPr>
-          <w:rFonts w:ascii="Arial" w:hAnsi="Arial" w:cs="Arial" w:eastAsia="Arial"/>
-          <w:b w:val="0"/>
-          <w:color w:val="000000"/>
-          <w:sz w:val="36"/>
-        </w:rPr>
-        <w:t>. THERE IT IS ON THE SCREEN.</w:t>
+        <w:t>RING VIDEO DOORBELL</w:t>
+      </w:r>
+      <w:r>
+        <w:rPr>
+          <w:rFonts w:ascii="Arial" w:hAnsi="Arial" w:cs="Arial" w:eastAsia="Arial"/>
+          <w:b w:val="0"/>
+          <w:color w:val="000000"/>
+          <w:sz w:val="36"/>
+        </w:rPr>
+        <w:t xml:space="preserve"> ON THE DOOR. SHE PRESSED IT.</w:t>
+      </w:r>
+    </w:p>
+    <w:p>
+      <w:pPr>
+        <w:spacing w:lineRule="auto" w:line="276" w:before="0" w:after="0"/>
+      </w:pPr>
+      <w:r>
+        <w:rPr>
+          <w:rFonts w:ascii="Arial" w:hAnsi="Arial" w:cs="Arial" w:eastAsia="Arial"/>
+          <w:b w:val="0"/>
+          <w:color w:val="000000"/>
+          <w:sz w:val="36"/>
+        </w:rPr>
+      </w:r>
+    </w:p>
+    <w:p>
+      <w:pPr>
+        <w:spacing w:lineRule="auto" w:line="276" w:before="0" w:after="0"/>
+      </w:pPr>
+      <w:r>
+        <w:rPr>
+          <w:rFonts w:ascii="Arial" w:hAnsi="Arial" w:cs="Arial" w:eastAsia="Arial"/>
+          <w:b w:val="0"/>
+          <w:color w:val="000000"/>
+          <w:sz w:val="36"/>
+        </w:rPr>
+        <w:t>-AND HIS CAREGIVER ANSWERED.</w:t>
+      </w:r>
+    </w:p>
+    <w:p>
+      <w:pPr>
+        <w:spacing w:lineRule="auto" w:line="276" w:before="0" w:after="0"/>
+      </w:pPr>
+      <w:r>
+        <w:rPr>
+          <w:rFonts w:ascii="Arial" w:hAnsi="Arial" w:cs="Arial" w:eastAsia="Arial"/>
+          <w:b w:val="0"/>
+          <w:color w:val="000000"/>
+          <w:sz w:val="36"/>
+        </w:rPr>
+      </w:r>
+    </w:p>
+    <w:p>
+      <w:pPr>
+        <w:spacing w:lineRule="auto" w:line="276" w:before="0" w:after="0"/>
+      </w:pPr>
+      <w:r>
+        <w:rPr>
+          <w:rFonts w:ascii="Arial" w:hAnsi="Arial" w:cs="Arial" w:eastAsia="Arial"/>
+          <w:b w:val="0"/>
+          <w:color w:val="000000"/>
+          <w:sz w:val="36"/>
+        </w:rPr>
+        <w:t>-SO WHAT DID SHE TELL HER, THROUGH A DOORBELL CAMERA???</w:t>
+      </w:r>
+    </w:p>
+    <w:p>
+      <w:pPr>
+        <w:spacing w:lineRule="auto" w:line="276" w:before="0" w:after="0"/>
+      </w:pPr>
+      <w:r>
+        <w:rPr>
+          <w:rFonts w:ascii="Arial" w:hAnsi="Arial" w:cs="Arial" w:eastAsia="Arial"/>
+          <w:b w:val="0"/>
+          <w:color w:val="000000"/>
+          <w:sz w:val="36"/>
+        </w:rPr>
+      </w:r>
+    </w:p>
+    <w:p>
+      <w:pPr>
+        <w:spacing w:lineRule="auto" w:line="276" w:before="0" w:after="0"/>
+      </w:pPr>
+      <w:r>
+        <w:rPr>
+          <w:rFonts w:ascii="Arial" w:hAnsi="Arial" w:cs="Arial" w:eastAsia="Arial"/>
+          <w:b w:val="0"/>
+          <w:color w:val="000000"/>
+          <w:sz w:val="36"/>
+        </w:rPr>
+        <w:t>-WATCH THIS. THIS IS UNBELIEVABLE.</w:t>
       </w:r>
     </w:p>
     <w:p>
@@ -2626,74 +2835,7 @@
           <w:color w:val="FF0000"/>
           <w:sz w:val="36"/>
         </w:rPr>
-        <w:t>(((INSERT GRAPHIC 003 - REPORTFRAUD.FTC.GOV)))</w:t>
-      </w:r>
-    </w:p>
-    <w:p>
-      <w:pPr>
-        <w:spacing w:lineRule="auto" w:line="276" w:before="0" w:after="0"/>
-      </w:pPr>
-      <w:r>
-        <w:rPr>
-          <w:rFonts w:ascii="Arial" w:hAnsi="Arial" w:cs="Arial" w:eastAsia="Arial"/>
-          <w:b w:val="0"/>
-          <w:color w:val="000000"/>
-          <w:sz w:val="36"/>
-        </w:rPr>
-      </w:r>
-    </w:p>
-    <w:p>
-      <w:pPr>
-        <w:spacing w:lineRule="auto" w:line="276" w:before="0" w:after="0"/>
-      </w:pPr>
-      <w:r>
-        <w:rPr>
-          <w:rFonts w:ascii="Arial" w:hAnsi="Arial" w:cs="Arial" w:eastAsia="Arial"/>
-          <w:b w:val="0"/>
-          <w:color w:val="000000"/>
-          <w:sz w:val="36"/>
-        </w:rPr>
-        <w:t>JEFF: NUMBER FOUR. THESE VICTIMS WERE TOO EMBARRASSED TO TELL ANYONE. HOW DO YOU TALK TO A LOVED ONE ABOUT THIS?</w:t>
-      </w:r>
-    </w:p>
-    <w:p>
-      <w:pPr>
-        <w:spacing w:lineRule="auto" w:line="276" w:before="0" w:after="0"/>
-      </w:pPr>
-      <w:r>
-        <w:rPr>
-          <w:rFonts w:ascii="Arial" w:hAnsi="Arial" w:cs="Arial" w:eastAsia="Arial"/>
-          <w:b w:val="0"/>
-          <w:color w:val="000000"/>
-          <w:sz w:val="36"/>
-        </w:rPr>
-      </w:r>
-    </w:p>
-    <w:p>
-      <w:pPr>
-        <w:spacing w:lineRule="auto" w:line="276" w:before="0" w:after="0"/>
-      </w:pPr>
-      <w:r>
-        <w:rPr>
-          <w:rFonts w:ascii="Arial" w:hAnsi="Arial" w:cs="Arial" w:eastAsia="Arial"/>
-          <w:b w:val="0"/>
-          <w:color w:val="000000"/>
-          <w:sz w:val="36"/>
-        </w:rPr>
-        <w:t>JEFF: TERESA, THANK YOU.</w:t>
-      </w:r>
-    </w:p>
-    <w:p>
-      <w:pPr>
-        <w:spacing w:lineRule="auto" w:line="276" w:before="0" w:after="0"/>
-      </w:pPr>
-      <w:r>
-        <w:rPr>
-          <w:rFonts w:ascii="Arial" w:hAnsi="Arial" w:cs="Arial" w:eastAsia="Arial"/>
-          <w:b w:val="0"/>
-          <w:color w:val="000000"/>
-          <w:sz w:val="36"/>
-        </w:rPr>
+        <w:t>(((PLAY CLIP 3 VERTICAL)))</w:t>
       </w:r>
     </w:p>
     <w:p>
@@ -2707,7 +2849,7 @@
           <w:color w:val="FF0000"/>
           <w:sz w:val="36"/>
         </w:rPr>
-        <w:t>(((TERESA EXITS)))</w:t>
+        <w:t>OUT: (THIS IS MY DAD'S HOUSE)</w:t>
       </w:r>
     </w:p>
     <w:p>
@@ -2734,608 +2876,9 @@
           <w:color w:val="FF0000"/>
           <w:sz w:val="36"/>
         </w:rPr>
-        <w:t>(((PRODUCER - CONFIRM TERESA HAS NO TIES TO ANY SPONSOR. THE U.S. PIRG EDUCATION FUND IS A NONPROFIT; IF THERE'S A TIE, JEFF DISCLOSES IT WHEN HE BRINGS HER IN.)))</w:t>
-      </w:r>
-    </w:p>
-    <w:p>
-      <w:pPr>
-        <w:spacing w:lineRule="auto" w:line="276" w:before="0" w:after="0"/>
-      </w:pPr>
-      <w:r>
-        <w:rPr>
-          <w:rFonts w:ascii="Arial" w:hAnsi="Arial" w:cs="Arial" w:eastAsia="Arial"/>
-          <w:b w:val="0"/>
-          <w:color w:val="000000"/>
-          <w:sz w:val="36"/>
-        </w:rPr>
-      </w:r>
-    </w:p>
-    <w:p>
-      <w:pPr>
-        <w:spacing w:lineRule="auto" w:line="276" w:before="0" w:after="0"/>
-      </w:pPr>
-      <w:r>
-        <w:rPr>
-          <w:rFonts w:ascii="Arial" w:hAnsi="Arial" w:cs="Arial" w:eastAsia="Arial"/>
-          <w:b w:val="0"/>
-          <w:color w:val="000000"/>
-          <w:sz w:val="36"/>
-        </w:rPr>
-        <w:t>-AND TALK TO YOUR FAMILY. THESE VICTIMS WERE TOO EMBARRASSED TO TELL ANYONE.</w:t>
-      </w:r>
-    </w:p>
-    <w:p>
-      <w:pPr>
-        <w:spacing w:lineRule="auto" w:line="276" w:before="0" w:after="0"/>
-      </w:pPr>
-      <w:r>
-        <w:rPr>
-          <w:rFonts w:ascii="Arial" w:hAnsi="Arial" w:cs="Arial" w:eastAsia="Arial"/>
-          <w:b w:val="0"/>
-          <w:color w:val="000000"/>
-          <w:sz w:val="36"/>
-        </w:rPr>
-      </w:r>
-    </w:p>
-    <w:p>
-      <w:pPr>
-        <w:spacing w:lineRule="auto" w:line="276" w:before="0" w:after="0"/>
-      </w:pPr>
-      <w:r>
-        <w:rPr>
-          <w:rFonts w:ascii="Arial" w:hAnsi="Arial" w:cs="Arial" w:eastAsia="Arial"/>
-          <w:b w:val="0"/>
-          <w:color w:val="000000"/>
-          <w:sz w:val="36"/>
-        </w:rPr>
-        <w:t>-NEXT, THE CAREGIVER WHO ENDED UP OWNING A MAN'S HOUSE… FOR FIVE DOLLARS!!</w:t>
-      </w:r>
-    </w:p>
-    <w:p>
-      <w:pPr>
-        <w:spacing w:lineRule="auto" w:line="276" w:before="0" w:after="0"/>
-      </w:pPr>
-      <w:r>
-        <w:rPr>
-          <w:rFonts w:ascii="Arial" w:hAnsi="Arial" w:cs="Arial" w:eastAsia="Arial"/>
-          <w:b w:val="0"/>
-          <w:color w:val="000000"/>
-          <w:sz w:val="36"/>
-        </w:rPr>
-      </w:r>
-    </w:p>
-    <w:p>
-      <w:pPr>
-        <w:spacing w:lineRule="auto" w:line="276" w:before="0" w:after="0"/>
-      </w:pPr>
-      <w:r>
-        <w:rPr>
-          <w:rFonts w:ascii="Arial" w:hAnsi="Arial" w:cs="Arial" w:eastAsia="Arial"/>
-          <w:b w:val="0"/>
-          <w:color w:val="000000"/>
-          <w:sz w:val="36"/>
-        </w:rPr>
-        <w:t>-BUT FIRST, A QUICK WORD FROM OUR SPONSOR.</w:t>
-      </w:r>
-    </w:p>
-    <w:p>
-      <w:pPr>
-        <w:spacing w:lineRule="auto" w:line="276" w:before="0" w:after="0"/>
-      </w:pPr>
-      <w:r>
-        <w:rPr>
-          <w:rFonts w:ascii="Arial" w:hAnsi="Arial" w:cs="Arial" w:eastAsia="Arial"/>
-          <w:b w:val="0"/>
-          <w:color w:val="000000"/>
-          <w:sz w:val="36"/>
-        </w:rPr>
-      </w:r>
-    </w:p>
-    <w:p>
-      <w:pPr>
-        <w:spacing w:lineRule="auto" w:line="276" w:before="0" w:after="0"/>
-      </w:pPr>
-      <w:r>
-        <w:rPr>
-          <w:rFonts w:ascii="Arial" w:hAnsi="Arial" w:cs="Arial" w:eastAsia="Arial"/>
-          <w:b/>
-          <w:color w:val="FF0000"/>
-          <w:sz w:val="36"/>
-        </w:rPr>
-        <w:t>(((SPONSOR TEASE - KILL BANNERS)))</w:t>
-      </w:r>
-    </w:p>
-    <w:p>
-      <w:pPr>
-        <w:spacing w:lineRule="auto" w:line="276" w:before="0" w:after="0"/>
-      </w:pPr>
-      <w:r>
-        <w:rPr>
-          <w:rFonts w:ascii="Arial" w:hAnsi="Arial" w:cs="Arial" w:eastAsia="Arial"/>
-          <w:b w:val="0"/>
-          <w:color w:val="000000"/>
-          <w:sz w:val="36"/>
-        </w:rPr>
-      </w:r>
-    </w:p>
-    <w:p>
-      <w:pPr>
-        <w:spacing w:lineRule="auto" w:line="276" w:before="0" w:after="0"/>
-      </w:pPr>
-      <w:r>
-        <w:rPr>
-          <w:rFonts w:ascii="Arial" w:hAnsi="Arial" w:cs="Arial" w:eastAsia="Arial"/>
-          <w:b/>
-          <w:color w:val="FF0000"/>
-          <w:sz w:val="36"/>
-        </w:rPr>
-        <w:t>(((OMNIWATCH SPOT)))</w:t>
-      </w:r>
-    </w:p>
-    <w:p>
-      <w:pPr>
-        <w:spacing w:lineRule="auto" w:line="276" w:before="0" w:after="0"/>
-      </w:pPr>
-      <w:r>
-        <w:rPr>
-          <w:rFonts w:ascii="Arial" w:hAnsi="Arial" w:cs="Arial" w:eastAsia="Arial"/>
-          <w:b w:val="0"/>
-          <w:color w:val="000000"/>
-          <w:sz w:val="36"/>
-        </w:rPr>
-      </w:r>
-    </w:p>
-    <w:p>
-      <w:pPr>
-        <w:spacing w:lineRule="auto" w:line="276" w:before="0" w:after="0"/>
-      </w:pPr>
-      <w:r>
-        <w:rPr>
-          <w:rFonts w:ascii="Arial" w:hAnsi="Arial" w:cs="Arial" w:eastAsia="Arial"/>
-          <w:b/>
-          <w:color w:val="000000"/>
-          <w:sz w:val="46"/>
-        </w:rPr>
-        <w:t>YOU HIRE SOMEONE TO TAKE CARE OF YOUR DAD… AND THEY END UP WITH HIS HOUSE</w:t>
-      </w:r>
-    </w:p>
-    <w:p>
-      <w:pPr>
-        <w:spacing w:lineRule="auto" w:line="276" w:before="0" w:after="0"/>
-      </w:pPr>
-      <w:r>
-        <w:rPr>
-          <w:rFonts w:ascii="Arial" w:hAnsi="Arial" w:cs="Arial" w:eastAsia="Arial"/>
-          <w:b w:val="0"/>
-          <w:color w:val="000000"/>
-          <w:sz w:val="36"/>
-        </w:rPr>
-      </w:r>
-    </w:p>
-    <w:p>
-      <w:pPr>
-        <w:spacing w:lineRule="auto" w:line="276" w:before="0" w:after="0"/>
-      </w:pPr>
-      <w:r>
-        <w:rPr>
-          <w:rFonts w:ascii="Arial" w:hAnsi="Arial" w:cs="Arial" w:eastAsia="Arial"/>
-          <w:b w:val="0"/>
-          <w:color w:val="000000"/>
-          <w:sz w:val="36"/>
-        </w:rPr>
-        <w:t>-THEY'RE IN THE HOUSE EVERY DAY. THEY HELP WITH THE PILLS, THE MAIL, THE BILLS.</w:t>
-      </w:r>
-    </w:p>
-    <w:p>
-      <w:pPr>
-        <w:spacing w:lineRule="auto" w:line="276" w:before="0" w:after="0"/>
-      </w:pPr>
-      <w:r>
-        <w:rPr>
-          <w:rFonts w:ascii="Arial" w:hAnsi="Arial" w:cs="Arial" w:eastAsia="Arial"/>
-          <w:b w:val="0"/>
-          <w:color w:val="000000"/>
-          <w:sz w:val="36"/>
-        </w:rPr>
-      </w:r>
-    </w:p>
-    <w:p>
-      <w:pPr>
-        <w:spacing w:lineRule="auto" w:line="276" w:before="0" w:after="0"/>
-      </w:pPr>
-      <w:r>
-        <w:rPr>
-          <w:rFonts w:ascii="Arial" w:hAnsi="Arial" w:cs="Arial" w:eastAsia="Arial"/>
-          <w:b w:val="0"/>
-          <w:color w:val="000000"/>
-          <w:sz w:val="36"/>
-        </w:rPr>
-        <w:t xml:space="preserve">-NOW IMAGINE FINDING OUT THEY HAVE HIS </w:t>
-      </w:r>
-      <w:r>
-        <w:rPr>
-          <w:rFonts w:ascii="Arial" w:hAnsi="Arial" w:cs="Arial" w:eastAsia="Arial"/>
-          <w:b/>
-          <w:color w:val="000000"/>
-          <w:sz w:val="36"/>
-        </w:rPr>
-        <w:t>POWER OF ATTORNEY</w:t>
-      </w:r>
-      <w:r>
-        <w:rPr>
-          <w:rFonts w:ascii="Arial" w:hAnsi="Arial" w:cs="Arial" w:eastAsia="Arial"/>
-          <w:b w:val="0"/>
-          <w:color w:val="000000"/>
-          <w:sz w:val="36"/>
-        </w:rPr>
-        <w:t>… AND HIS HOUSE.</w:t>
-      </w:r>
-    </w:p>
-    <w:p>
-      <w:pPr>
-        <w:spacing w:lineRule="auto" w:line="276" w:before="0" w:after="0"/>
-      </w:pPr>
-      <w:r>
-        <w:rPr>
-          <w:rFonts w:ascii="Arial" w:hAnsi="Arial" w:cs="Arial" w:eastAsia="Arial"/>
-          <w:b w:val="0"/>
-          <w:color w:val="000000"/>
-          <w:sz w:val="36"/>
-        </w:rPr>
-      </w:r>
-    </w:p>
-    <w:p>
-      <w:pPr>
-        <w:spacing w:lineRule="auto" w:line="276" w:before="0" w:after="0"/>
-      </w:pPr>
-      <w:r>
-        <w:rPr>
-          <w:rFonts w:ascii="Arial" w:hAnsi="Arial" w:cs="Arial" w:eastAsia="Arial"/>
-          <w:b w:val="0"/>
-          <w:color w:val="000000"/>
-          <w:sz w:val="36"/>
-        </w:rPr>
-        <w:t>-THAT'S THE PIECE OF PAPER. AND WE FOUND THREE FAMILIES IT HAPPENED TO.</w:t>
-      </w:r>
-    </w:p>
-    <w:p>
-      <w:pPr>
-        <w:spacing w:lineRule="auto" w:line="276" w:before="0" w:after="0"/>
-      </w:pPr>
-      <w:r>
-        <w:rPr>
-          <w:rFonts w:ascii="Arial" w:hAnsi="Arial" w:cs="Arial" w:eastAsia="Arial"/>
-          <w:b w:val="0"/>
-          <w:color w:val="000000"/>
-          <w:sz w:val="36"/>
-        </w:rPr>
-      </w:r>
-    </w:p>
-    <w:p>
-      <w:pPr>
-        <w:spacing w:lineRule="auto" w:line="276" w:before="0" w:after="0"/>
-      </w:pPr>
-      <w:r>
-        <w:rPr>
-          <w:rFonts w:ascii="Arial" w:hAnsi="Arial" w:cs="Arial" w:eastAsia="Arial"/>
-          <w:b/>
-          <w:color w:val="000000"/>
-          <w:sz w:val="46"/>
-        </w:rPr>
-        <w:t>SHE DROVE SEVEN HOURS TO CHECK ON HER DAD… AND THE CAREGIVER HAD HIS HOUSE!!</w:t>
-      </w:r>
-    </w:p>
-    <w:p>
-      <w:pPr>
-        <w:spacing w:lineRule="auto" w:line="276" w:before="0" w:after="0"/>
-      </w:pPr>
-      <w:r>
-        <w:rPr>
-          <w:rFonts w:ascii="Arial" w:hAnsi="Arial" w:cs="Arial" w:eastAsia="Arial"/>
-          <w:b w:val="0"/>
-          <w:color w:val="000000"/>
-          <w:sz w:val="36"/>
-        </w:rPr>
-      </w:r>
-    </w:p>
-    <w:p>
-      <w:pPr>
-        <w:spacing w:lineRule="auto" w:line="276" w:before="0" w:after="0"/>
-      </w:pPr>
-      <w:r>
-        <w:rPr>
-          <w:rFonts w:ascii="Arial" w:hAnsi="Arial" w:cs="Arial" w:eastAsia="Arial"/>
-          <w:b w:val="0"/>
-          <w:color w:val="000000"/>
-          <w:sz w:val="36"/>
-        </w:rPr>
-        <w:t xml:space="preserve">-NORA'S DAD, BOB, HAD </w:t>
-      </w:r>
-      <w:r>
-        <w:rPr>
-          <w:rFonts w:ascii="Arial" w:hAnsi="Arial" w:cs="Arial" w:eastAsia="Arial"/>
-          <w:b/>
-          <w:color w:val="000000"/>
-          <w:sz w:val="36"/>
-        </w:rPr>
-        <w:t>PARKINSON'S</w:t>
-      </w:r>
-      <w:r>
-        <w:rPr>
-          <w:rFonts w:ascii="Arial" w:hAnsi="Arial" w:cs="Arial" w:eastAsia="Arial"/>
-          <w:b w:val="0"/>
-          <w:color w:val="000000"/>
-          <w:sz w:val="36"/>
-        </w:rPr>
-        <w:t xml:space="preserve"> AND A BRAIN INJURY.</w:t>
-      </w:r>
-    </w:p>
-    <w:p>
-      <w:pPr>
-        <w:spacing w:lineRule="auto" w:line="276" w:before="0" w:after="0"/>
-      </w:pPr>
-      <w:r>
-        <w:rPr>
-          <w:rFonts w:ascii="Arial" w:hAnsi="Arial" w:cs="Arial" w:eastAsia="Arial"/>
-          <w:b w:val="0"/>
-          <w:color w:val="000000"/>
-          <w:sz w:val="36"/>
-        </w:rPr>
-      </w:r>
-    </w:p>
-    <w:p>
-      <w:pPr>
-        <w:spacing w:lineRule="auto" w:line="276" w:before="0" w:after="0"/>
-      </w:pPr>
-      <w:r>
-        <w:rPr>
-          <w:rFonts w:ascii="Arial" w:hAnsi="Arial" w:cs="Arial" w:eastAsia="Arial"/>
-          <w:b w:val="0"/>
-          <w:color w:val="000000"/>
-          <w:sz w:val="36"/>
-        </w:rPr>
-        <w:t>-SHE LIVED SEVEN HOURS AWAY, SO SHE HIRED IN-HOME HELP.</w:t>
-      </w:r>
-    </w:p>
-    <w:p>
-      <w:pPr>
-        <w:spacing w:lineRule="auto" w:line="276" w:before="0" w:after="0"/>
-      </w:pPr>
-      <w:r>
-        <w:rPr>
-          <w:rFonts w:ascii="Arial" w:hAnsi="Arial" w:cs="Arial" w:eastAsia="Arial"/>
-          <w:b w:val="0"/>
-          <w:color w:val="000000"/>
-          <w:sz w:val="36"/>
-        </w:rPr>
-      </w:r>
-    </w:p>
-    <w:p>
-      <w:pPr>
-        <w:spacing w:lineRule="auto" w:line="276" w:before="0" w:after="0"/>
-      </w:pPr>
-      <w:r>
-        <w:rPr>
-          <w:rFonts w:ascii="Arial" w:hAnsi="Arial" w:cs="Arial" w:eastAsia="Arial"/>
-          <w:b w:val="0"/>
-          <w:color w:val="000000"/>
-          <w:sz w:val="36"/>
-        </w:rPr>
-        <w:t xml:space="preserve">-THEN HE STOPPED ANSWERING HER CALLS. EVEN ON </w:t>
-      </w:r>
-      <w:r>
-        <w:rPr>
-          <w:rFonts w:ascii="Arial" w:hAnsi="Arial" w:cs="Arial" w:eastAsia="Arial"/>
-          <w:b/>
-          <w:color w:val="000000"/>
-          <w:sz w:val="36"/>
-        </w:rPr>
-        <w:t>FATHER'S DAY</w:t>
-      </w:r>
-      <w:r>
-        <w:rPr>
-          <w:rFonts w:ascii="Arial" w:hAnsi="Arial" w:cs="Arial" w:eastAsia="Arial"/>
-          <w:b w:val="0"/>
-          <w:color w:val="000000"/>
-          <w:sz w:val="36"/>
-        </w:rPr>
-        <w:t>.</w:t>
-      </w:r>
-    </w:p>
-    <w:p>
-      <w:pPr>
-        <w:spacing w:lineRule="auto" w:line="276" w:before="0" w:after="0"/>
-      </w:pPr>
-      <w:r>
-        <w:rPr>
-          <w:rFonts w:ascii="Arial" w:hAnsi="Arial" w:cs="Arial" w:eastAsia="Arial"/>
-          <w:b w:val="0"/>
-          <w:color w:val="000000"/>
-          <w:sz w:val="36"/>
-        </w:rPr>
-      </w:r>
-    </w:p>
-    <w:p>
-      <w:pPr>
-        <w:spacing w:lineRule="auto" w:line="276" w:before="0" w:after="0"/>
-      </w:pPr>
-      <w:r>
-        <w:rPr>
-          <w:rFonts w:ascii="Arial" w:hAnsi="Arial" w:cs="Arial" w:eastAsia="Arial"/>
-          <w:b w:val="0"/>
-          <w:color w:val="000000"/>
-          <w:sz w:val="36"/>
-        </w:rPr>
-        <w:t xml:space="preserve">-SO SHE DROVE DOWN. THERE WAS A NEW </w:t>
-      </w:r>
-      <w:r>
-        <w:rPr>
-          <w:rFonts w:ascii="Arial" w:hAnsi="Arial" w:cs="Arial" w:eastAsia="Arial"/>
-          <w:b/>
-          <w:color w:val="000000"/>
-          <w:sz w:val="36"/>
-        </w:rPr>
-        <w:t>RING VIDEO DOORBELL</w:t>
-      </w:r>
-      <w:r>
-        <w:rPr>
-          <w:rFonts w:ascii="Arial" w:hAnsi="Arial" w:cs="Arial" w:eastAsia="Arial"/>
-          <w:b w:val="0"/>
-          <w:color w:val="000000"/>
-          <w:sz w:val="36"/>
-        </w:rPr>
-        <w:t xml:space="preserve"> ON THE DOOR. SHE PRESSED IT.</w:t>
-      </w:r>
-    </w:p>
-    <w:p>
-      <w:pPr>
-        <w:spacing w:lineRule="auto" w:line="276" w:before="0" w:after="0"/>
-      </w:pPr>
-      <w:r>
-        <w:rPr>
-          <w:rFonts w:ascii="Arial" w:hAnsi="Arial" w:cs="Arial" w:eastAsia="Arial"/>
-          <w:b w:val="0"/>
-          <w:color w:val="000000"/>
-          <w:sz w:val="36"/>
-        </w:rPr>
-      </w:r>
-    </w:p>
-    <w:p>
-      <w:pPr>
-        <w:spacing w:lineRule="auto" w:line="276" w:before="0" w:after="0"/>
-      </w:pPr>
-      <w:r>
-        <w:rPr>
-          <w:rFonts w:ascii="Arial" w:hAnsi="Arial" w:cs="Arial" w:eastAsia="Arial"/>
-          <w:b w:val="0"/>
-          <w:color w:val="000000"/>
-          <w:sz w:val="36"/>
-        </w:rPr>
-        <w:t>-AND HIS CAREGIVER ANSWERED.</w:t>
-      </w:r>
-    </w:p>
-    <w:p>
-      <w:pPr>
-        <w:spacing w:lineRule="auto" w:line="276" w:before="0" w:after="0"/>
-      </w:pPr>
-      <w:r>
-        <w:rPr>
-          <w:rFonts w:ascii="Arial" w:hAnsi="Arial" w:cs="Arial" w:eastAsia="Arial"/>
-          <w:b w:val="0"/>
-          <w:color w:val="000000"/>
-          <w:sz w:val="36"/>
-        </w:rPr>
-      </w:r>
-    </w:p>
-    <w:p>
-      <w:pPr>
-        <w:spacing w:lineRule="auto" w:line="276" w:before="0" w:after="0"/>
-      </w:pPr>
-      <w:r>
-        <w:rPr>
-          <w:rFonts w:ascii="Arial" w:hAnsi="Arial" w:cs="Arial" w:eastAsia="Arial"/>
-          <w:b w:val="0"/>
-          <w:color w:val="000000"/>
-          <w:sz w:val="36"/>
-        </w:rPr>
-        <w:t>-SO WHAT DID SHE TELL HER, THROUGH A DOORBELL CAMERA???</w:t>
-      </w:r>
-    </w:p>
-    <w:p>
-      <w:pPr>
-        <w:spacing w:lineRule="auto" w:line="276" w:before="0" w:after="0"/>
-      </w:pPr>
-      <w:r>
-        <w:rPr>
-          <w:rFonts w:ascii="Arial" w:hAnsi="Arial" w:cs="Arial" w:eastAsia="Arial"/>
-          <w:b w:val="0"/>
-          <w:color w:val="000000"/>
-          <w:sz w:val="36"/>
-        </w:rPr>
-      </w:r>
-    </w:p>
-    <w:p>
-      <w:pPr>
-        <w:spacing w:lineRule="auto" w:line="276" w:before="0" w:after="0"/>
-      </w:pPr>
-      <w:r>
-        <w:rPr>
-          <w:rFonts w:ascii="Arial" w:hAnsi="Arial" w:cs="Arial" w:eastAsia="Arial"/>
-          <w:b w:val="0"/>
-          <w:color w:val="000000"/>
-          <w:sz w:val="36"/>
-        </w:rPr>
-        <w:t>-WATCH THIS. THIS IS UNBELIEVABLE.</w:t>
-      </w:r>
-    </w:p>
-    <w:p>
-      <w:pPr>
-        <w:spacing w:lineRule="auto" w:line="276" w:before="0" w:after="0"/>
-      </w:pPr>
-      <w:r>
-        <w:rPr>
-          <w:rFonts w:ascii="Arial" w:hAnsi="Arial" w:cs="Arial" w:eastAsia="Arial"/>
-          <w:b w:val="0"/>
-          <w:color w:val="000000"/>
-          <w:sz w:val="36"/>
-        </w:rPr>
-      </w:r>
-    </w:p>
-    <w:p>
-      <w:pPr>
-        <w:spacing w:lineRule="auto" w:line="276" w:before="0" w:after="0"/>
-      </w:pPr>
-      <w:r>
-        <w:rPr>
-          <w:rFonts w:ascii="Arial" w:hAnsi="Arial" w:cs="Arial" w:eastAsia="Arial"/>
-          <w:b/>
-          <w:color w:val="FF0000"/>
-          <w:sz w:val="36"/>
-        </w:rPr>
-        <w:t>(((PLAY CLIP 4 VERTICAL)))</w:t>
-      </w:r>
-    </w:p>
-    <w:p>
-      <w:pPr>
-        <w:spacing w:lineRule="auto" w:line="276" w:before="0" w:after="0"/>
-      </w:pPr>
-      <w:r>
-        <w:rPr>
-          <w:rFonts w:ascii="Arial" w:hAnsi="Arial" w:cs="Arial" w:eastAsia="Arial"/>
-          <w:b/>
-          <w:color w:val="FF0000"/>
-          <w:sz w:val="36"/>
-        </w:rPr>
-        <w:t>OUT: (THIS IS MY DAD'S HOUSE)</w:t>
-      </w:r>
-    </w:p>
-    <w:p>
-      <w:pPr>
-        <w:spacing w:lineRule="auto" w:line="276" w:before="0" w:after="0"/>
-      </w:pPr>
-      <w:r>
-        <w:rPr>
-          <w:rFonts w:ascii="Arial" w:hAnsi="Arial" w:cs="Arial" w:eastAsia="Arial"/>
-          <w:b w:val="0"/>
-          <w:color w:val="000000"/>
-          <w:sz w:val="36"/>
-        </w:rPr>
-      </w:r>
-    </w:p>
-    <w:p>
-      <w:pPr>
-        <w:spacing w:lineRule="auto" w:line="276" w:before="0" w:after="0"/>
-      </w:pPr>
-      <w:r>
-        <w:rPr>
-          <w:rFonts w:ascii="Arial" w:hAnsi="Arial" w:cs="Arial" w:eastAsia="Arial"/>
-          <w:b/>
-          <w:color w:val="FF0000"/>
-          <w:sz w:val="36"/>
-        </w:rPr>
         <w:t>(((</w:t>
       </w:r>
-      <w:hyperlink r:id="rId12">
+      <w:hyperlink r:id="rId11">
         <w:r>
           <w:rPr>
             <w:color w:val="1155CC"/>
@@ -3632,7 +3175,7 @@
           <w:color w:val="FF0000"/>
           <w:sz w:val="36"/>
         </w:rPr>
-        <w:t>(((PLAY CLIP 5 HORIZONTAL)))</w:t>
+        <w:t>(((PLAY CLIP 4 HORIZONTAL)))</w:t>
       </w:r>
     </w:p>
     <w:p>
@@ -3675,7 +3218,7 @@
         </w:rPr>
         <w:t>(((</w:t>
       </w:r>
-      <w:hyperlink r:id="rId13">
+      <w:hyperlink r:id="rId12">
         <w:r>
           <w:rPr>
             <w:color w:val="1155CC"/>
@@ -4215,7 +3758,7 @@
           <w:color w:val="FF0000"/>
           <w:sz w:val="36"/>
         </w:rPr>
-        <w:t>(((PLAY CLIP 6 HORIZONTAL BROLL)))</w:t>
+        <w:t>(((PLAY CLIP 5 HORIZONTAL BROLL)))</w:t>
       </w:r>
     </w:p>
     <w:p>
@@ -4258,7 +3801,7 @@
         </w:rPr>
         <w:t>(((</w:t>
       </w:r>
-      <w:hyperlink r:id="rId14">
+      <w:hyperlink r:id="rId13">
         <w:r>
           <w:rPr>
             <w:color w:val="1155CC"/>
@@ -4303,7 +3846,7 @@
           <w:color w:val="FF0000"/>
           <w:sz w:val="36"/>
         </w:rPr>
-        <w:t>(((JEFF TALK OVER - CLIP 6 RUNS WITHOUT SOUND)))</w:t>
+        <w:t>(((JEFF TALK OVER - CLIP 5 RUNS WITHOUT SOUND)))</w:t>
       </w:r>
     </w:p>
     <w:p>
@@ -4600,7 +4143,7 @@
           <w:color w:val="FF0000"/>
           <w:sz w:val="36"/>
         </w:rPr>
-        <w:t>(((PLAY CLIP 7 HORIZONTAL)))</w:t>
+        <w:t>(((PLAY CLIP 6 HORIZONTAL)))</w:t>
       </w:r>
     </w:p>
     <w:p>
@@ -4643,7 +4186,7 @@
         </w:rPr>
         <w:t>(((</w:t>
       </w:r>
-      <w:hyperlink r:id="rId15">
+      <w:hyperlink r:id="rId14">
         <w:r>
           <w:rPr>
             <w:color w:val="1155CC"/>
@@ -4688,7 +4231,7 @@
           <w:color w:val="FF0000"/>
           <w:sz w:val="36"/>
         </w:rPr>
-        <w:t>(((PRODUCER - CLIP 7 IS ON A NEWS SITE AND ITS TIMECODES HAVEN'T BEEN CHECKED AGAINST A TRANSCRIPT. PULL IT AND SET THE OUT. THE OUTLINE'S "$100" DEED PRICE ISN'T IN ANY WRITTEN SOURCE; ONLY PUT IT BACK IF THE CBS AUDIO SAYS IT.)))</w:t>
+        <w:t>(((PRODUCER - CLIP 6 IS ON A NEWS SITE AND ITS TIMECODES HAVEN'T BEEN CHECKED AGAINST A TRANSCRIPT. PULL IT AND SET THE OUT. THE OUTLINE'S "$100" DEED PRICE ISN'T IN ANY WRITTEN SOURCE; ONLY PUT IT BACK IF THE CBS AUDIO SAYS IT.)))</w:t>
       </w:r>
     </w:p>
     <w:p>
@@ -5687,7 +5230,7 @@
           <w:color w:val="FF0000"/>
           <w:sz w:val="36"/>
         </w:rPr>
-        <w:t>(((PLAY CLIP 8 VERTICAL)))</w:t>
+        <w:t>(((PLAY CLIP 7 VERTICAL)))</w:t>
       </w:r>
     </w:p>
     <w:p>
@@ -5730,7 +5273,7 @@
         </w:rPr>
         <w:t>(((</w:t>
       </w:r>
-      <w:hyperlink r:id="rId16">
+      <w:hyperlink r:id="rId15">
         <w:r>
           <w:rPr>
             <w:color w:val="1155CC"/>
@@ -6324,7 +5867,7 @@
           <w:color w:val="FF0000"/>
           <w:sz w:val="36"/>
         </w:rPr>
-        <w:t>(((PLAY CLIP 9 VERTICAL)))</w:t>
+        <w:t>(((PLAY CLIP 8 VERTICAL)))</w:t>
       </w:r>
     </w:p>
     <w:p>
@@ -6367,7 +5910,7 @@
         </w:rPr>
         <w:t>(((</w:t>
       </w:r>
-      <w:hyperlink r:id="rId17">
+      <w:hyperlink r:id="rId16">
         <w:r>
           <w:rPr>
             <w:color w:val="1155CC"/>

</xml_diff>